<commit_message>
Entregable semana 2: PDF de 4 páginas con figura fija y rutas acortadas
</commit_message>
<xml_diff>
--- a/entregables/semana2/Entregable_Semana2_Pipeline_Reproducible_CarlosPerez.docx
+++ b/entregables/semana2/Entregable_Semana2_Pipeline_Reproducible_CarlosPerez.docx
@@ -323,7 +323,7 @@
               <w:rPr>
                 <w:rStyle w:val="VerbatimChar"/>
               </w:rPr>
-              <w:t xml:space="preserve">fase3_v2/ablacion_final.json</w:t>
+              <w:t xml:space="preserve">ablacion_final.json</w:t>
             </w:r>
             <w:r>
               <w:t xml:space="preserve">)</w:t>
@@ -382,7 +382,7 @@
               <w:rPr>
                 <w:rStyle w:val="VerbatimChar"/>
               </w:rPr>
-              <w:t xml:space="preserve">fase9_final/resultados_finales.json</w:t>
+              <w:t xml:space="preserve">resultados_finales.json</w:t>
             </w:r>
             <w:r>
               <w:t xml:space="preserve">)</w:t>
@@ -542,7 +542,7 @@
               <w:t xml:space="preserve">fase9_modelo_final.py</w:t>
             </w:r>
             <w:r>
-              <w:t xml:space="preserve">, líneas 223–250)</w:t>
+              <w:t xml:space="preserve">, l. 223–250)</w:t>
             </w:r>
           </w:p>
         </w:tc>
@@ -581,19 +581,16 @@
               <w:pStyle w:val="Compact"/>
             </w:pPr>
             <w:r>
-              <w:t xml:space="preserve">Cascada de dos etapas: E1 detección evento sí/no con</w:t>
-            </w:r>
-            <w:r>
-              <w:t xml:space="preserve"> </w:t>
+              <w:t xml:space="preserve">Cascada de dos etapas: E1 detección evento sí/no con LinearSVC balanceado (</w:t>
             </w:r>
             <w:r>
               <w:rPr>
                 <w:rStyle w:val="VerbatimChar"/>
               </w:rPr>
-              <w:t xml:space="preserve">LinearSVC(class_weight="balanced")</w:t>
-            </w:r>
-            <w:r>
-              <w:t xml:space="preserve">; E2 naturaleza del evento, 6 clases multietiqueta,</w:t>
+              <w:t xml:space="preserve">class_weight</w:t>
+            </w:r>
+            <w:r>
+              <w:t xml:space="preserve">); E2 naturaleza del evento, 6 clases multietiqueta,</w:t>
             </w:r>
             <w:r>
               <w:t xml:space="preserve"> </w:t>
@@ -718,7 +715,7 @@
               <w:rPr>
                 <w:rStyle w:val="VerbatimChar"/>
               </w:rPr>
-              <w:t xml:space="preserve">fase12/sistema_vs_experto.json</w:t>
+              <w:t xml:space="preserve">sistema_vs_experto.json</w:t>
             </w:r>
           </w:p>
         </w:tc>
@@ -774,7 +771,7 @@
               <w:rPr>
                 <w:rStyle w:val="VerbatimChar"/>
               </w:rPr>
-              <w:t xml:space="preserve">05_prototipo_app/motor_v2.py</w:t>
+              <w:t xml:space="preserve">motor_v2.py</w:t>
             </w:r>
             <w:r>
               <w:t xml:space="preserve">,</w:t>
@@ -938,7 +935,7 @@
         <w:rPr>
           <w:rStyle w:val="VerbatimChar"/>
         </w:rPr>
-        <w:t xml:space="preserve">05_validacion_experta/REPORTE_VALIDACION_70_EVENTOS.md</w:t>
+        <w:t xml:space="preserve">REPORTE_VALIDACION_70_EVENTOS.md</w:t>
       </w:r>
       <w:r>
         <w:t xml:space="preserve">), y TF-IDF + regresión logística (Fase 4).</w:t>
@@ -991,7 +988,7 @@
         <w:rPr>
           <w:rStyle w:val="VerbatimChar"/>
         </w:rPr>
-        <w:t xml:space="preserve">fase11/resultados_transformers.json</w:t>
+        <w:t xml:space="preserve">resultados_transformers.json</w:t>
       </w:r>
       <w:r>
         <w:t xml:space="preserve">); BioClinical ModernBERT con ventana de 1024 tokens 0.428 tras 42.5 h de GPU (</w:t>
@@ -1000,7 +997,7 @@
         <w:rPr>
           <w:rStyle w:val="VerbatimChar"/>
         </w:rPr>
-        <w:t xml:space="preserve">fase13/modernbert_final.json</w:t>
+        <w:t xml:space="preserve">modernbert_final.json</w:t>
       </w:r>
       <w:r>
         <w:t xml:space="preserve">); Llama 3.2 3B</w:t>
@@ -1028,7 +1025,7 @@
         <w:rPr>
           <w:rStyle w:val="VerbatimChar"/>
         </w:rPr>
-        <w:t xml:space="preserve">fase13/llm_local_vs_experto.json</w:t>
+        <w:t xml:space="preserve">llm_local_vs_experto.json</w:t>
       </w:r>
       <w:r>
         <w:t xml:space="preserve">). Causa medida: la ventana de 256 tokens cubre el 9 % de una epicrisis (mediana 3 148 tokens). Se documenta como resultado negativo; solo se reabriría con Longformer o BigBird y GPU dedicada.</w:t>
@@ -1496,7 +1493,7 @@
         <w:rPr>
           <w:rStyle w:val="VerbatimChar"/>
         </w:rPr>
-        <w:t xml:space="preserve">04_pipeline_codigo/datos_intermedios/fase*/</w:t>
+        <w:t xml:space="preserve">datos_intermedios/fase*/</w:t>
       </w:r>
       <w:r>
         <w:t xml:space="preserve">, más bitácoras fechadas en</w:t>
@@ -2230,7 +2227,13 @@
           <w:b/>
           <w:bCs/>
         </w:rPr>
-        <w:t xml:space="preserve">Fuentes abiertas para este entregable:</w:t>
+        <w:t xml:space="preserve">Fuentes abiertas para este entregable</w:t>
+      </w:r>
+      <w:r>
+        <w:t xml:space="preserve"> </w:t>
+      </w:r>
+      <w:r>
+        <w:t xml:space="preserve">(todas en el repositorio de la tesis</w:t>
       </w:r>
       <w:r>
         <w:t xml:space="preserve"> </w:t>
@@ -2239,6 +2242,24 @@
         <w:rPr>
           <w:rStyle w:val="VerbatimChar"/>
         </w:rPr>
+        <w:t xml:space="preserve">tesis-gemses-mimic-pipeline</w:t>
+      </w:r>
+      <w:r>
+        <w:t xml:space="preserve">):</w:t>
+      </w:r>
+    </w:p>
+    <w:p>
+      <w:pPr>
+        <w:pStyle w:val="Compact"/>
+        <w:numPr>
+          <w:ilvl w:val="0"/>
+          <w:numId w:val="1003"/>
+        </w:numPr>
+      </w:pPr>
+      <w:r>
+        <w:rPr>
+          <w:rStyle w:val="VerbatimChar"/>
+        </w:rPr>
         <w:t xml:space="preserve">11_proyecto_II/01_INVENTARIO_MODELOS_Y_CHECKLIST_2026-09-18.md</w:t>
       </w:r>
       <w:r>
@@ -2257,11 +2278,17 @@
         <w:t xml:space="preserve">02_ESTADO_DE_AVANCE_COMPLETO_2026-09-18.md</w:t>
       </w:r>
       <w:r>
-        <w:t xml:space="preserve">;</w:t>
-      </w:r>
-      <w:r>
-        <w:t xml:space="preserve"> </w:t>
-      </w:r>
+        <w:t xml:space="preserve">.</w:t>
+      </w:r>
+    </w:p>
+    <w:p>
+      <w:pPr>
+        <w:pStyle w:val="Compact"/>
+        <w:numPr>
+          <w:ilvl w:val="0"/>
+          <w:numId w:val="1003"/>
+        </w:numPr>
+      </w:pPr>
       <w:r>
         <w:rPr>
           <w:rStyle w:val="VerbatimChar"/>
@@ -2269,10 +2296,7 @@
         <w:t xml:space="preserve">04_pipeline_codigo/fase9_modelo_final.py</w:t>
       </w:r>
       <w:r>
-        <w:t xml:space="preserve"> </w:t>
-      </w:r>
-      <w:r>
-        <w:t xml:space="preserve">y</w:t>
+        <w:t xml:space="preserve">,</w:t>
       </w:r>
       <w:r>
         <w:t xml:space="preserve"> </w:t>
@@ -2284,7 +2308,10 @@
         <w:t xml:space="preserve">fase10_metricas_corregidas.py</w:t>
       </w:r>
       <w:r>
-        <w:t xml:space="preserve">; los JSON citados en</w:t>
+        <w:t xml:space="preserve"> </w:t>
+      </w:r>
+      <w:r>
+        <w:t xml:space="preserve">y los JSON de</w:t>
       </w:r>
       <w:r>
         <w:t xml:space="preserve"> </w:t>
@@ -2293,14 +2320,20 @@
         <w:rPr>
           <w:rStyle w:val="VerbatimChar"/>
         </w:rPr>
-        <w:t xml:space="preserve">04_pipeline_codigo/datos_intermedios/</w:t>
-      </w:r>
-      <w:r>
-        <w:t xml:space="preserve">;</w:t>
-      </w:r>
-      <w:r>
-        <w:t xml:space="preserve"> </w:t>
-      </w:r>
+        <w:t xml:space="preserve">datos_intermedios/</w:t>
+      </w:r>
+      <w:r>
+        <w:t xml:space="preserve">.</w:t>
+      </w:r>
+    </w:p>
+    <w:p>
+      <w:pPr>
+        <w:pStyle w:val="Compact"/>
+        <w:numPr>
+          <w:ilvl w:val="0"/>
+          <w:numId w:val="1003"/>
+        </w:numPr>
+      </w:pPr>
       <w:r>
         <w:rPr>
           <w:rStyle w:val="VerbatimChar"/>
@@ -2308,19 +2341,22 @@
         <w:t xml:space="preserve">latex_tesis/3_1_CAPITULO_MARCO_TEORICO/Capitulo3.tex</w:t>
       </w:r>
       <w:r>
-        <w:t xml:space="preserve">; Directiva N.º 7-OGCyH-ESSALUD-2020 (RGG 402-GG-ESSALUD-2020), Anexos 02 y 03. Todo en el repositorio de la tesis</w:t>
-      </w:r>
-      <w:r>
-        <w:t xml:space="preserve"> </w:t>
-      </w:r>
-      <w:r>
-        <w:rPr>
-          <w:rStyle w:val="VerbatimChar"/>
-        </w:rPr>
-        <w:t xml:space="preserve">tesis-gemses-mimic-pipeline</w:t>
-      </w:r>
-      <w:r>
-        <w:t xml:space="preserve">.</w:t>
+        <w:t xml:space="preserve"> </w:t>
+      </w:r>
+      <w:r>
+        <w:t xml:space="preserve">(hipótesis y umbral de kappa).</w:t>
+      </w:r>
+    </w:p>
+    <w:p>
+      <w:pPr>
+        <w:pStyle w:val="Compact"/>
+        <w:numPr>
+          <w:ilvl w:val="0"/>
+          <w:numId w:val="1003"/>
+        </w:numPr>
+      </w:pPr>
+      <w:r>
+        <w:t xml:space="preserve">Directiva N.º 7-OGCyH-ESSALUD-2020 (RGG 402-GG-ESSALUD-2020), Anexos 02 y 03.</w:t>
       </w:r>
     </w:p>
     <w:bookmarkEnd w:id="18"/>
@@ -2544,6 +2580,9 @@
     <w:abstractNumId w:val="991"/>
   </w:num>
   <w:num w:numId="1002">
+    <w:abstractNumId w:val="991"/>
+  </w:num>
+  <w:num w:numId="1003">
     <w:abstractNumId w:val="991"/>
   </w:num>
 </w:numbering>

</xml_diff>

<commit_message>
Entregable semana 2: portada y referencias sin desbordes
</commit_message>
<xml_diff>
--- a/entregables/semana2/Entregable_Semana2_Pipeline_Reproducible_CarlosPerez.docx
+++ b/entregables/semana2/Entregable_Semana2_Pipeline_Reproducible_CarlosPerez.docx
@@ -23,7 +23,7 @@
         <w:pStyle w:val="Author"/>
       </w:pPr>
       <w:r>
-        <w:t xml:space="preserve">Carlos Pérez Pérez · Maestría en Inteligencia Artificial, FIIS-UNI · Trabajo de Investigación II (MIA-14, Sección B) · Docente: Dr. Ing. Glen Rodríguez Rafael</w:t>
+        <w:t xml:space="preserve">Carlos Pérez Pérez · Maestría en Inteligencia Artificial, FIIS-UNI</w:t>
       </w:r>
     </w:p>
     <w:p>
@@ -31,7 +31,7 @@
         <w:pStyle w:val="Date"/>
       </w:pPr>
       <w:r>
-        <w:t xml:space="preserve">25 de septiembre de 2026</w:t>
+        <w:t xml:space="preserve">Trabajo de Investigación II (MIA-14, Sección B) · Docente: Dr. Ing. Glen Rodríguez Rafael · 25 de septiembre de 2026</w:t>
       </w:r>
     </w:p>
     <w:p>
@@ -926,19 +926,7 @@
         <w:t xml:space="preserve"> </w:t>
       </w:r>
       <w:r>
-        <w:t xml:space="preserve">reglas regex Tier B + NegEx, precisión 65.7 % (IC95 54.0–75.8, n = 70,</w:t>
-      </w:r>
-      <w:r>
-        <w:t xml:space="preserve"> </w:t>
-      </w:r>
-      <w:r>
-        <w:rPr>
-          <w:rStyle w:val="VerbatimChar"/>
-        </w:rPr>
-        <w:t xml:space="preserve">REPORTE_VALIDACION_70_EVENTOS.md</w:t>
-      </w:r>
-      <w:r>
-        <w:t xml:space="preserve">), y TF-IDF + regresión logística (Fase 4).</w:t>
+        <w:t xml:space="preserve">reglas regex Tier B + NegEx, precisión 65.7 % (IC95 54.0–75.8, n = 70, reporte de validación de 70 eventos), y TF-IDF + regresión logística (Fase 4).</w:t>
       </w:r>
     </w:p>
     <w:p>
@@ -2233,19 +2221,7 @@
         <w:t xml:space="preserve"> </w:t>
       </w:r>
       <w:r>
-        <w:t xml:space="preserve">(todas en el repositorio de la tesis</w:t>
-      </w:r>
-      <w:r>
-        <w:t xml:space="preserve"> </w:t>
-      </w:r>
-      <w:r>
-        <w:rPr>
-          <w:rStyle w:val="VerbatimChar"/>
-        </w:rPr>
-        <w:t xml:space="preserve">tesis-gemses-mimic-pipeline</w:t>
-      </w:r>
-      <w:r>
-        <w:t xml:space="preserve">):</w:t>
+        <w:t xml:space="preserve">(todas en el repositorio de la tesis tesis-gemses-mimic-pipeline):</w:t>
       </w:r>
     </w:p>
     <w:p>
@@ -2257,28 +2233,7 @@
         </w:numPr>
       </w:pPr>
       <w:r>
-        <w:rPr>
-          <w:rStyle w:val="VerbatimChar"/>
-        </w:rPr>
-        <w:t xml:space="preserve">11_proyecto_II/01_INVENTARIO_MODELOS_Y_CHECKLIST_2026-09-18.md</w:t>
-      </w:r>
-      <w:r>
-        <w:t xml:space="preserve"> </w:t>
-      </w:r>
-      <w:r>
-        <w:t xml:space="preserve">y</w:t>
-      </w:r>
-      <w:r>
-        <w:t xml:space="preserve"> </w:t>
-      </w:r>
-      <w:r>
-        <w:rPr>
-          <w:rStyle w:val="VerbatimChar"/>
-        </w:rPr>
-        <w:t xml:space="preserve">02_ESTADO_DE_AVANCE_COMPLETO_2026-09-18.md</w:t>
-      </w:r>
-      <w:r>
-        <w:t xml:space="preserve">.</w:t>
+        <w:t xml:space="preserve">11_proyecto_II: 01_INVENTARIO_MODELOS_Y_CHECKLIST_2026-09-18.md y 02_ESTADO_DE_AVANCE_COMPLETO_2026-09-18.md.</w:t>
       </w:r>
     </w:p>
     <w:p>
@@ -2290,40 +2245,7 @@
         </w:numPr>
       </w:pPr>
       <w:r>
-        <w:rPr>
-          <w:rStyle w:val="VerbatimChar"/>
-        </w:rPr>
-        <w:t xml:space="preserve">04_pipeline_codigo/fase9_modelo_final.py</w:t>
-      </w:r>
-      <w:r>
-        <w:t xml:space="preserve">,</w:t>
-      </w:r>
-      <w:r>
-        <w:t xml:space="preserve"> </w:t>
-      </w:r>
-      <w:r>
-        <w:rPr>
-          <w:rStyle w:val="VerbatimChar"/>
-        </w:rPr>
-        <w:t xml:space="preserve">fase10_metricas_corregidas.py</w:t>
-      </w:r>
-      <w:r>
-        <w:t xml:space="preserve"> </w:t>
-      </w:r>
-      <w:r>
-        <w:t xml:space="preserve">y los JSON de</w:t>
-      </w:r>
-      <w:r>
-        <w:t xml:space="preserve"> </w:t>
-      </w:r>
-      <w:r>
-        <w:rPr>
-          <w:rStyle w:val="VerbatimChar"/>
-        </w:rPr>
-        <w:t xml:space="preserve">datos_intermedios/</w:t>
-      </w:r>
-      <w:r>
-        <w:t xml:space="preserve">.</w:t>
+        <w:t xml:space="preserve">04_pipeline_codigo: fase9_modelo_final.py, fase10_metricas_corregidas.py y los JSON de datos_intermedios.</w:t>
       </w:r>
     </w:p>
     <w:p>
@@ -2335,16 +2257,7 @@
         </w:numPr>
       </w:pPr>
       <w:r>
-        <w:rPr>
-          <w:rStyle w:val="VerbatimChar"/>
-        </w:rPr>
-        <w:t xml:space="preserve">latex_tesis/3_1_CAPITULO_MARCO_TEORICO/Capitulo3.tex</w:t>
-      </w:r>
-      <w:r>
-        <w:t xml:space="preserve"> </w:t>
-      </w:r>
-      <w:r>
-        <w:t xml:space="preserve">(hipótesis y umbral de kappa).</w:t>
+        <w:t xml:space="preserve">latex_tesis: Capitulo3.tex (hipótesis y umbral de kappa).</w:t>
       </w:r>
     </w:p>
     <w:p>

</xml_diff>

<commit_message>
Entregable semana 2: ajuste final de márgenes y referencias
</commit_message>
<xml_diff>
--- a/entregables/semana2/Entregable_Semana2_Pipeline_Reproducible_CarlosPerez.docx
+++ b/entregables/semana2/Entregable_Semana2_Pipeline_Reproducible_CarlosPerez.docx
@@ -115,7 +115,7 @@
       <w:r>
         <w:drawing>
           <wp:inline>
-            <wp:extent cx="5334000" cy="3460937"/>
+            <wp:extent cx="5120640" cy="3322499"/>
             <wp:effectExtent b="0" l="0" r="0" t="0"/>
             <wp:docPr descr="Pipeline reproducible en seis etapas, con las salidas de cada una, los controles contra fugas y el estado de reproducibilidad." title="" id="10" name="Picture"/>
             <a:graphic>
@@ -136,7 +136,7 @@
                   <pic:spPr bwMode="auto">
                     <a:xfrm>
                       <a:off x="0" y="0"/>
-                      <a:ext cx="5334000" cy="3460937"/>
+                      <a:ext cx="5120640" cy="3322499"/>
                     </a:xfrm>
                     <a:prstGeom prst="rect">
                       <a:avLst/>
@@ -2233,7 +2233,19 @@
         </w:numPr>
       </w:pPr>
       <w:r>
-        <w:t xml:space="preserve">11_proyecto_II: 01_INVENTARIO_MODELOS_Y_CHECKLIST_2026-09-18.md y 02_ESTADO_DE_AVANCE_COMPLETO_2026-09-18.md.</w:t>
+        <w:t xml:space="preserve">11_proyecto_II: 01_INVENTARIO_MODELOS_Y_CHECKLIST_2026-09-18.md</w:t>
+      </w:r>
+    </w:p>
+    <w:p>
+      <w:pPr>
+        <w:pStyle w:val="Compact"/>
+        <w:numPr>
+          <w:ilvl w:val="0"/>
+          <w:numId w:val="1003"/>
+        </w:numPr>
+      </w:pPr>
+      <w:r>
+        <w:t xml:space="preserve">11_proyecto_II: 02_ESTADO_DE_AVANCE_COMPLETO_2026-09-18.md</w:t>
       </w:r>
     </w:p>
     <w:p>

</xml_diff>

<commit_message>
Entregable semana 2: portada con logo UNI y título oficial, proceso de obtención de MIMIC-IV (requisitos y tiempos), sin rutas de archivos; trazabilidad de cifras aparte
</commit_message>
<xml_diff>
--- a/entregables/semana2/Entregable_Semana2_Pipeline_Reproducible_CarlosPerez.docx
+++ b/entregables/semana2/Entregable_Semana2_Pipeline_Reproducible_CarlosPerez.docx
@@ -7,128 +7,228 @@
         <w:pStyle w:val="Title"/>
       </w:pPr>
       <w:r>
-        <w:t xml:space="preserve">Entregable Semana 2 — Diseño reproducible del flujo experimental</w:t>
-      </w:r>
-    </w:p>
-    <w:p>
-      <w:pPr>
-        <w:pStyle w:val="Subtitle"/>
-      </w:pPr>
-      <w:r>
-        <w:t xml:space="preserve">Detección automatizada y priorización de eventos adversos en epicrisis (MIMIC-IV) mediante NLP y aprendizaje supervisado, con la Matriz de Priorización GEMSES</w:t>
-      </w:r>
-    </w:p>
-    <w:p>
-      <w:pPr>
-        <w:pStyle w:val="Author"/>
-      </w:pPr>
-      <w:r>
-        <w:t xml:space="preserve">Carlos Pérez Pérez · Maestría en Inteligencia Artificial, FIIS-UNI</w:t>
-      </w:r>
-    </w:p>
-    <w:p>
-      <w:pPr>
-        <w:pStyle w:val="Date"/>
-      </w:pPr>
-      <w:r>
-        <w:t xml:space="preserve">Trabajo de Investigación II (MIA-14, Sección B) · Docente: Dr. Ing. Glen Rodríguez Rafael · 25 de septiembre de 2026</w:t>
-      </w:r>
-    </w:p>
-    <w:p>
-      <w:pPr>
-        <w:pStyle w:val="FirstParagraph"/>
-      </w:pPr>
-      <w:r>
-        <w:rPr>
-          <w:b/>
-          <w:bCs/>
-        </w:rPr>
-        <w:t xml:space="preserve">Tipo de tesis:</w:t>
-      </w:r>
-      <w:r>
-        <w:t xml:space="preserve"> </w:t>
-      </w:r>
-      <w:r>
-        <w:t xml:space="preserve">aprendizaje supervisado (clasificación de texto clínico), con dos adaptaciones: la etiqueta de entrenamiento es de</w:t>
-      </w:r>
-      <w:r>
-        <w:t xml:space="preserve"> </w:t>
-      </w:r>
-      <w:r>
-        <w:rPr>
-          <w:i/>
-          <w:iCs/>
-        </w:rPr>
-        <w:t xml:space="preserve">supervisión débil</w:t>
-      </w:r>
-      <w:r>
-        <w:t xml:space="preserve"> </w:t>
-      </w:r>
-      <w:r>
-        <w:t xml:space="preserve">(códigos CIE-10 causales) y la evaluación se cierra con un panel de expertos y con un corpus en español con etiqueta humana.</w:t>
-      </w:r>
-    </w:p>
-    <w:p>
-      <w:pPr>
-        <w:pStyle w:val="BodyText"/>
-      </w:pPr>
-      <w:r>
-        <w:rPr>
-          <w:b/>
-          <w:bCs/>
-        </w:rPr>
-        <w:t xml:space="preserve">Continuidad.</w:t>
-      </w:r>
-      <w:r>
-        <w:t xml:space="preserve"> </w:t>
-      </w:r>
-      <w:r>
-        <w:t xml:space="preserve">Este diseño no parte de cero. Es la continuación de Trabajo de Investigación I (MIA-303, Mg. María Tejada, cerrado el 14-jul-2026) e integra en un solo flujo lo aprendido en tres frentes: la tesis (Fases 3v2 a 13), el curso de PLN (MIA-10, auditoría adversarial de 26 hallazgos) y GEM·VigIA (corpus ERSP de EsSalud en producción). Cada cifra sale de un archivo de resultados del repositorio de la tesis (fuente única); las cifras que el propio proceso invalidó no se citan. Lo que es criterio propio va rotulado</w:t>
-      </w:r>
-      <w:r>
-        <w:t xml:space="preserve"> </w:t>
-      </w:r>
-      <w:r>
-        <w:rPr>
-          <w:b/>
-          <w:bCs/>
-        </w:rPr>
-        <w:t xml:space="preserve">[juicio técnico]</w:t>
-      </w:r>
-      <w:r>
-        <w:t xml:space="preserve">.</w:t>
-      </w:r>
-    </w:p>
-    <w:bookmarkStart w:id="12" w:name="diagrama-del-flujo-principal"/>
-    <w:p>
-      <w:pPr>
-        <w:pStyle w:val="Heading1"/>
-      </w:pPr>
-      <w:r>
-        <w:t xml:space="preserve">1. Diagrama del flujo principal</w:t>
-      </w:r>
-    </w:p>
-    <w:p>
-      <w:pPr>
-        <w:pStyle w:val="CaptionedFigure"/>
-      </w:pPr>
-      <w:r>
         <w:drawing>
           <wp:inline>
-            <wp:extent cx="5120640" cy="3322499"/>
+            <wp:extent cx="1259999" cy="1584449"/>
             <wp:effectExtent b="0" l="0" r="0" t="0"/>
-            <wp:docPr descr="Pipeline reproducible en seis etapas, con las salidas de cada una, los controles contra fugas y el estado de reproducibilidad." title="" id="10" name="Picture"/>
+            <wp:docPr descr="" title="" id="10" name="Picture"/>
             <a:graphic>
               <a:graphicData uri="http://schemas.openxmlformats.org/drawingml/2006/picture">
                 <pic:pic>
                   <pic:nvPicPr>
-                    <pic:cNvPr descr="fig_pipeline_semana2.png" id="11" name="Picture"/>
+                    <pic:cNvPr descr="logo_uni.png" id="11" name="Picture"/>
                     <pic:cNvPicPr>
                       <a:picLocks noChangeArrowheads="1" noChangeAspect="1"/>
                     </pic:cNvPicPr>
                   </pic:nvPicPr>
                   <pic:blipFill>
                     <a:blip r:embed="rId9"/>
+                    <a:stretch>
+                      <a:fillRect/>
+                    </a:stretch>
+                  </pic:blipFill>
+                  <pic:spPr bwMode="auto">
+                    <a:xfrm>
+                      <a:off x="0" y="0"/>
+                      <a:ext cx="1259999" cy="1584449"/>
+                    </a:xfrm>
+                    <a:prstGeom prst="rect">
+                      <a:avLst/>
+                    </a:prstGeom>
+                    <a:noFill/>
+                    <a:ln w="9525">
+                      <a:noFill/>
+                      <a:headEnd/>
+                      <a:tailEnd/>
+                    </a:ln>
+                  </pic:spPr>
+                </pic:pic>
+              </a:graphicData>
+            </a:graphic>
+          </wp:inline>
+        </w:drawing>
+      </w:r>
+    </w:p>
+    <w:p>
+      <w:pPr>
+        <w:pStyle w:val="Subtitle"/>
+      </w:pPr>
+      <w:r>
+        <w:t xml:space="preserve">UNIVERSIDAD NACIONAL DE INGENIERÍA · Facultad de Ingeniería Industrial y de Sistemas · Maestría en Inteligencia Artificial</w:t>
+      </w:r>
+    </w:p>
+    <w:p>
+      <w:pPr>
+        <w:pStyle w:val="Title"/>
+      </w:pPr>
+      <w:r>
+        <w:t xml:space="preserve">ENTREGABLE SEMANA 2</w:t>
+      </w:r>
+    </w:p>
+    <w:p>
+      <w:pPr>
+        <w:pStyle w:val="Subtitle"/>
+      </w:pPr>
+      <w:r>
+        <w:t xml:space="preserve">Curso: MIA-14 · Trabajo de Investigación II · Sección B · 2026-2</w:t>
+      </w:r>
+    </w:p>
+    <w:p>
+      <w:pPr>
+        <w:pStyle w:val="Author"/>
+      </w:pPr>
+      <w:r>
+        <w:rPr>
+          <w:b/>
+          <w:bCs/>
+        </w:rPr>
+        <w:t xml:space="preserve">Proceso:</w:t>
+      </w:r>
+      <w:r>
+        <w:t xml:space="preserve"> </w:t>
+      </w:r>
+      <w:r>
+        <w:t xml:space="preserve">Diseño reproducible del flujo experimental: pipeline de aprendizaje supervisado para la detección y priorización de eventos adversos</w:t>
+      </w:r>
+    </w:p>
+    <w:p>
+      <w:pPr>
+        <w:pStyle w:val="Author"/>
+      </w:pPr>
+      <w:r>
+        <w:rPr>
+          <w:b/>
+          <w:bCs/>
+        </w:rPr>
+        <w:t xml:space="preserve">Tesis:</w:t>
+      </w:r>
+      <w:r>
+        <w:t xml:space="preserve"> </w:t>
+      </w:r>
+      <w:r>
+        <w:rPr>
+          <w:i/>
+          <w:iCs/>
+        </w:rPr>
+        <w:t xml:space="preserve">Detección Automatizada y Priorización de Eventos Adversos en Notas Clínicas mediante un Flujo de Procesamiento (Pipeline) de NLP y Aprendizaje Automático — Aplicación de la Matriz de Priorización del Modelo GEMSES sobre MIMIC-IV</w:t>
+      </w:r>
+    </w:p>
+    <w:p>
+      <w:pPr>
+        <w:pStyle w:val="Author"/>
+      </w:pPr>
+      <w:r>
+        <w:t xml:space="preserve">Autor: Carlos Pérez Pérez · Docente: Dr. Ing. Glen Dario Rodríguez Rafael</w:t>
+      </w:r>
+    </w:p>
+    <w:p>
+      <w:pPr>
+        <w:pStyle w:val="Date"/>
+      </w:pPr>
+      <w:r>
+        <w:t xml:space="preserve">Lima, 25 de septiembre de 2026</w:t>
+      </w:r>
+    </w:p>
+    <w:p>
+      <w:r>
+        <w:br w:type="page"/>
+      </w:r>
+    </w:p>
+    <w:p>
+      <w:pPr>
+        <w:pStyle w:val="BodyText"/>
+      </w:pPr>
+      <w:r>
+        <w:rPr>
+          <w:b/>
+          <w:bCs/>
+        </w:rPr>
+        <w:t xml:space="preserve">Tipo de tesis:</w:t>
+      </w:r>
+      <w:r>
+        <w:t xml:space="preserve"> </w:t>
+      </w:r>
+      <w:r>
+        <w:t xml:space="preserve">aprendizaje supervisado (clasificación de texto clínico), con dos adaptaciones: la etiqueta de entrenamiento es de</w:t>
+      </w:r>
+      <w:r>
+        <w:t xml:space="preserve"> </w:t>
+      </w:r>
+      <w:r>
+        <w:rPr>
+          <w:i/>
+          <w:iCs/>
+        </w:rPr>
+        <w:t xml:space="preserve">supervisión débil</w:t>
+      </w:r>
+      <w:r>
+        <w:t xml:space="preserve"> </w:t>
+      </w:r>
+      <w:r>
+        <w:t xml:space="preserve">(códigos CIE-10 causales) y la evaluación se cierra con un panel de expertos y con un corpus en español con etiqueta humana.</w:t>
+      </w:r>
+    </w:p>
+    <w:p>
+      <w:pPr>
+        <w:pStyle w:val="BodyText"/>
+      </w:pPr>
+      <w:r>
+        <w:rPr>
+          <w:b/>
+          <w:bCs/>
+        </w:rPr>
+        <w:t xml:space="preserve">Continuidad.</w:t>
+      </w:r>
+      <w:r>
+        <w:t xml:space="preserve"> </w:t>
+      </w:r>
+      <w:r>
+        <w:t xml:space="preserve">El título de la tesis es el mismo del proyecto aprobado en Trabajo de Investigación I (MIA-303, cerrado el 14-jul-2026). Lo que ha cambiado es lo que se ha probado y mejorado desde entonces: este diseño integra en un solo flujo la ejecución de la tesis (Fases 3v2 a 13), lo aprendido en el curso de Procesamiento de Lenguaje Natural (auditoría adversarial de 26 hallazgos) y la experiencia del sistema GEM·VigIA sobre reportes de EsSalud en producción. Todas las cifras provienen de archivos de resultados del proyecto; las que el propio proceso invalidó no se citan. Lo que es criterio propio va rotulado</w:t>
+      </w:r>
+      <w:r>
+        <w:t xml:space="preserve"> </w:t>
+      </w:r>
+      <w:r>
+        <w:rPr>
+          <w:b/>
+          <w:bCs/>
+        </w:rPr>
+        <w:t xml:space="preserve">[juicio técnico]</w:t>
+      </w:r>
+      <w:r>
+        <w:t xml:space="preserve">.</w:t>
+      </w:r>
+    </w:p>
+    <w:bookmarkStart w:id="15" w:name="diagrama-del-flujo-principal"/>
+    <w:p>
+      <w:pPr>
+        <w:pStyle w:val="Heading1"/>
+      </w:pPr>
+      <w:r>
+        <w:t xml:space="preserve">1. Diagrama del flujo principal</w:t>
+      </w:r>
+    </w:p>
+    <w:p>
+      <w:pPr>
+        <w:pStyle w:val="CaptionedFigure"/>
+      </w:pPr>
+      <w:r>
+        <w:drawing>
+          <wp:inline>
+            <wp:extent cx="5120640" cy="3322499"/>
+            <wp:effectExtent b="0" l="0" r="0" t="0"/>
+            <wp:docPr descr="Pipeline reproducible en seis etapas, con la salida de cada una, los controles contra fugas y el estado de reproducibilidad." title="" id="13" name="Picture"/>
+            <a:graphic>
+              <a:graphicData uri="http://schemas.openxmlformats.org/drawingml/2006/picture">
+                <pic:pic>
+                  <pic:nvPicPr>
+                    <pic:cNvPr descr="fig_pipeline_semana2.png" id="14" name="Picture"/>
+                    <pic:cNvPicPr>
+                      <a:picLocks noChangeArrowheads="1" noChangeAspect="1"/>
+                    </pic:cNvPicPr>
+                  </pic:nvPicPr>
+                  <pic:blipFill>
+                    <a:blip r:embed="rId12"/>
                     <a:stretch>
                       <a:fillRect/>
                     </a:stretch>
@@ -160,11 +260,11 @@
         <w:pStyle w:val="ImageCaption"/>
       </w:pPr>
       <w:r>
-        <w:t xml:space="preserve">Pipeline reproducible en seis etapas, con las salidas de cada una, los controles contra fugas y el estado de reproducibilidad.</w:t>
-      </w:r>
-    </w:p>
-    <w:bookmarkEnd w:id="12"/>
-    <w:bookmarkStart w:id="13" w:name="X288f691d8149b13965dbf9fed092a1f114938de"/>
+        <w:t xml:space="preserve">Pipeline reproducible en seis etapas, con la salida de cada una, los controles contra fugas y el estado de reproducibilidad.</w:t>
+      </w:r>
+    </w:p>
+    <w:bookmarkEnd w:id="15"/>
+    <w:bookmarkStart w:id="16" w:name="X288f691d8149b13965dbf9fed092a1f114938de"/>
     <w:p>
       <w:pPr>
         <w:pStyle w:val="Heading1"/>
@@ -258,7 +358,7 @@
               <w:pStyle w:val="Compact"/>
             </w:pPr>
             <w:r>
-              <w:t xml:space="preserve">MIMIC-IV v3.1 + MIMIC-IV-Note v2.2 (DUA PhysioNet), leídos con DuckDB</w:t>
+              <w:t xml:space="preserve">MIMIC-IV v3.1 + MIMIC-IV-Note v2.2 (acuerdo de uso PhysioNet), leídos con DuckDB</w:t>
             </w:r>
           </w:p>
         </w:tc>
@@ -279,54 +379,18 @@
               <w:t xml:space="preserve">discharge summaries</w:t>
             </w:r>
             <w:r>
-              <w:t xml:space="preserve">) con</w:t>
-            </w:r>
-            <w:r>
-              <w:t xml:space="preserve"> </w:t>
-            </w:r>
-            <w:r>
-              <w:rPr>
-                <w:rStyle w:val="VerbatimChar"/>
-              </w:rPr>
-              <w:t xml:space="preserve">subject_id</w:t>
-            </w:r>
-            <w:r>
-              <w:t xml:space="preserve">,</w:t>
-            </w:r>
-            <w:r>
-              <w:t xml:space="preserve"> </w:t>
-            </w:r>
-            <w:r>
-              <w:rPr>
-                <w:rStyle w:val="VerbatimChar"/>
-              </w:rPr>
-              <w:t xml:space="preserve">hadm_id</w:t>
-            </w:r>
-            <w:r>
-              <w:t xml:space="preserve"> </w:t>
-            </w:r>
-            <w:r>
-              <w:t xml:space="preserve">y códigos de egreso</w:t>
-            </w:r>
-          </w:p>
-        </w:tc>
-        <w:tc>
-          <w:tcPr/>
-          <w:p>
-            <w:pPr>
-              <w:pStyle w:val="Compact"/>
-            </w:pPr>
-            <w:r>
-              <w:t xml:space="preserve">331 793 epicrisis de 145 914 pacientes (</w:t>
-            </w:r>
-            <w:r>
-              <w:rPr>
-                <w:rStyle w:val="VerbatimChar"/>
-              </w:rPr>
-              <w:t xml:space="preserve">ablacion_final.json</w:t>
-            </w:r>
-            <w:r>
-              <w:t xml:space="preserve">)</w:t>
+              <w:t xml:space="preserve">) con identificador de paciente, de hospitalización y códigos de egreso</w:t>
+            </w:r>
+          </w:p>
+        </w:tc>
+        <w:tc>
+          <w:tcPr/>
+          <w:p>
+            <w:pPr>
+              <w:pStyle w:val="Compact"/>
+            </w:pPr>
+            <w:r>
+              <w:t xml:space="preserve">331 793 epicrisis de 145 914 pacientes</w:t>
             </w:r>
           </w:p>
         </w:tc>
@@ -376,16 +440,7 @@
               <w:pStyle w:val="Compact"/>
             </w:pPr>
             <w:r>
-              <w:t xml:space="preserve">Corpus de modelado de 70 000 epicrisis con prevalencia real 0.2012 (</w:t>
-            </w:r>
-            <w:r>
-              <w:rPr>
-                <w:rStyle w:val="VerbatimChar"/>
-              </w:rPr>
-              <w:t xml:space="preserve">resultados_finales.json</w:t>
-            </w:r>
-            <w:r>
-              <w:t xml:space="preserve">)</w:t>
+              <w:t xml:space="preserve">Corpus de modelado de 70 000 epicrisis con prevalencia real 0.2012</w:t>
             </w:r>
           </w:p>
         </w:tc>
@@ -424,89 +479,7 @@
               <w:pStyle w:val="Compact"/>
             </w:pPr>
             <w:r>
-              <w:rPr>
-                <w:rStyle w:val="VerbatimChar"/>
-              </w:rPr>
-              <w:t xml:space="preserve">GroupShuffleSplit</w:t>
-            </w:r>
-            <w:r>
-              <w:t xml:space="preserve"> </w:t>
-            </w:r>
-            <w:r>
-              <w:t xml:space="preserve">por paciente, test 20 %, semilla 42, con</w:t>
-            </w:r>
-            <w:r>
-              <w:t xml:space="preserve"> </w:t>
-            </w:r>
-            <w:r>
-              <w:rPr>
-                <w:i/>
-                <w:iCs/>
-              </w:rPr>
-              <w:t xml:space="preserve">assert</w:t>
-            </w:r>
-            <w:r>
-              <w:t xml:space="preserve"> </w:t>
-            </w:r>
-            <w:r>
-              <w:t xml:space="preserve">de pacientes disjuntos; TF-IDF de palabras (1–2-gramas, 60 000 rasgos,</w:t>
-            </w:r>
-            <w:r>
-              <w:t xml:space="preserve"> </w:t>
-            </w:r>
-            <w:r>
-              <w:rPr>
-                <w:rStyle w:val="VerbatimChar"/>
-              </w:rPr>
-              <w:t xml:space="preserve">min_df</w:t>
-            </w:r>
-            <w:r>
-              <w:t xml:space="preserve"> </w:t>
-            </w:r>
-            <w:r>
-              <w:t xml:space="preserve">3) + TF-IDF de caracteres</w:t>
-            </w:r>
-            <w:r>
-              <w:t xml:space="preserve"> </w:t>
-            </w:r>
-            <w:r>
-              <w:rPr>
-                <w:rStyle w:val="VerbatimChar"/>
-              </w:rPr>
-              <w:t xml:space="preserve">char_wb</w:t>
-            </w:r>
-            <w:r>
-              <w:t xml:space="preserve"> </w:t>
-            </w:r>
-            <w:r>
-              <w:t xml:space="preserve">(3–5, 20 000,</w:t>
-            </w:r>
-            <w:r>
-              <w:t xml:space="preserve"> </w:t>
-            </w:r>
-            <w:r>
-              <w:rPr>
-                <w:rStyle w:val="VerbatimChar"/>
-              </w:rPr>
-              <w:t xml:space="preserve">min_df</w:t>
-            </w:r>
-            <w:r>
-              <w:t xml:space="preserve"> </w:t>
-            </w:r>
-            <w:r>
-              <w:t xml:space="preserve">5),</w:t>
-            </w:r>
-            <w:r>
-              <w:t xml:space="preserve"> </w:t>
-            </w:r>
-            <w:r>
-              <w:rPr>
-                <w:rStyle w:val="VerbatimChar"/>
-              </w:rPr>
-              <w:t xml:space="preserve">sublinear_tf</w:t>
-            </w:r>
-            <w:r>
-              <w:t xml:space="preserve">; el vocabulario se ajusta</w:t>
+              <w:t xml:space="preserve">Partición por paciente (GroupShuffleSplit), test 20 %, semilla 42, con verificación de pacientes disjuntos; TF-IDF de palabras (1–2-gramas, 60 000 rasgos, mínimo 3 documentos) + TF-IDF de caracteres (3–5, 20 000 rasgos, mínimo 5), escala sublineal; el vocabulario se ajusta</w:t>
             </w:r>
             <w:r>
               <w:t xml:space="preserve"> </w:t>
@@ -527,22 +500,7 @@
               <w:pStyle w:val="Compact"/>
             </w:pPr>
             <w:r>
-              <w:rPr>
-                <w:rStyle w:val="VerbatimChar"/>
-              </w:rPr>
-              <w:t xml:space="preserve">dataset_final.parquet</w:t>
-            </w:r>
-            <w:r>
-              <w:t xml:space="preserve">; matrices dispersas (</w:t>
-            </w:r>
-            <w:r>
-              <w:rPr>
-                <w:rStyle w:val="VerbatimChar"/>
-              </w:rPr>
-              <w:t xml:space="preserve">fase9_modelo_final.py</w:t>
-            </w:r>
-            <w:r>
-              <w:t xml:space="preserve">, l. 223–250)</w:t>
+              <w:t xml:space="preserve">Conjunto de datos final en formato Parquet; matrices dispersas</w:t>
             </w:r>
           </w:p>
         </w:tc>
@@ -581,48 +539,18 @@
               <w:pStyle w:val="Compact"/>
             </w:pPr>
             <w:r>
-              <w:t xml:space="preserve">Cascada de dos etapas: E1 detección evento sí/no con LinearSVC balanceado (</w:t>
-            </w:r>
-            <w:r>
-              <w:rPr>
-                <w:rStyle w:val="VerbatimChar"/>
-              </w:rPr>
-              <w:t xml:space="preserve">class_weight</w:t>
-            </w:r>
-            <w:r>
-              <w:t xml:space="preserve">); E2 naturaleza del evento, 6 clases multietiqueta,</w:t>
-            </w:r>
-            <w:r>
-              <w:t xml:space="preserve"> </w:t>
-            </w:r>
-            <w:r>
-              <w:rPr>
-                <w:rStyle w:val="VerbatimChar"/>
-              </w:rPr>
-              <w:t xml:space="preserve">OneVsRest(LinearSVC)</w:t>
-            </w:r>
-            <w:r>
-              <w:t xml:space="preserve">, entrenada solo con positivos y con su propia partición por paciente; prueba de abstención con 6 textos triviales</w:t>
-            </w:r>
-          </w:p>
-        </w:tc>
-        <w:tc>
-          <w:tcPr/>
-          <w:p>
-            <w:pPr>
-              <w:pStyle w:val="Compact"/>
-            </w:pPr>
-            <w:r>
-              <w:rPr>
-                <w:rStyle w:val="VerbatimChar"/>
-              </w:rPr>
-              <w:t xml:space="preserve">modelo_final.pkl</w:t>
-            </w:r>
-            <w:r>
-              <w:t xml:space="preserve"> </w:t>
-            </w:r>
-            <w:r>
-              <w:t xml:space="preserve">(10.7 MB, fuera de git por el DUA)</w:t>
+              <w:t xml:space="preserve">Cascada de dos etapas: E1 detección evento sí/no con LinearSVC balanceado; E2 naturaleza del evento, 6 clases multietiqueta, OneVsRest(LinearSVC), entrenada solo con positivos y con su propia partición por paciente; prueba de abstención con 6 textos triviales</w:t>
+            </w:r>
+          </w:p>
+        </w:tc>
+        <w:tc>
+          <w:tcPr/>
+          <w:p>
+            <w:pPr>
+              <w:pStyle w:val="Compact"/>
+            </w:pPr>
+            <w:r>
+              <w:t xml:space="preserve">Modelo final serializado (10.7 MB, fuera de git por el acuerdo de uso)</w:t>
             </w:r>
           </w:p>
         </w:tc>
@@ -650,7 +578,7 @@
               <w:pStyle w:val="Compact"/>
             </w:pPr>
             <w:r>
-              <w:t xml:space="preserve">Test reservado; panel experto; ERSP</w:t>
+              <w:t xml:space="preserve">Test reservado; panel experto; corpus ERSP</w:t>
             </w:r>
           </w:p>
         </w:tc>
@@ -688,34 +616,7 @@
               <w:pStyle w:val="Compact"/>
             </w:pPr>
             <w:r>
-              <w:rPr>
-                <w:rStyle w:val="VerbatimChar"/>
-              </w:rPr>
-              <w:t xml:space="preserve">resultados_finales.json</w:t>
-            </w:r>
-            <w:r>
-              <w:t xml:space="preserve">,</w:t>
-            </w:r>
-            <w:r>
-              <w:t xml:space="preserve"> </w:t>
-            </w:r>
-            <w:r>
-              <w:rPr>
-                <w:rStyle w:val="VerbatimChar"/>
-              </w:rPr>
-              <w:t xml:space="preserve">metricas_corregidas.json</w:t>
-            </w:r>
-            <w:r>
-              <w:t xml:space="preserve">,</w:t>
-            </w:r>
-            <w:r>
-              <w:t xml:space="preserve"> </w:t>
-            </w:r>
-            <w:r>
-              <w:rPr>
-                <w:rStyle w:val="VerbatimChar"/>
-              </w:rPr>
-              <w:t xml:space="preserve">sistema_vs_experto.json</w:t>
+              <w:t xml:space="preserve">JSON de resultados finales; JSON de métricas corregidas; JSON de sistema contra experto</w:t>
             </w:r>
           </w:p>
         </w:tc>
@@ -765,28 +666,7 @@
               <w:pStyle w:val="Compact"/>
             </w:pPr>
             <w:r>
-              <w:t xml:space="preserve">Tablero de priorización (</w:t>
-            </w:r>
-            <w:r>
-              <w:rPr>
-                <w:rStyle w:val="VerbatimChar"/>
-              </w:rPr>
-              <w:t xml:space="preserve">motor_v2.py</w:t>
-            </w:r>
-            <w:r>
-              <w:t xml:space="preserve">,</w:t>
-            </w:r>
-            <w:r>
-              <w:t xml:space="preserve"> </w:t>
-            </w:r>
-            <w:r>
-              <w:rPr>
-                <w:rStyle w:val="VerbatimChar"/>
-              </w:rPr>
-              <w:t xml:space="preserve">gemses_priorizacion.py</w:t>
-            </w:r>
-            <w:r>
-              <w:t xml:space="preserve">)</w:t>
+              <w:t xml:space="preserve">Tablero de priorización (prototipo)</w:t>
             </w:r>
           </w:p>
         </w:tc>
@@ -870,41 +750,663 @@
         <w:t xml:space="preserve">paciente</w:t>
       </w:r>
       <w:r>
-        <w:t xml:space="preserve">: ningún</w:t>
-      </w:r>
-      <w:r>
-        <w:t xml:space="preserve"> </w:t>
-      </w:r>
+        <w:t xml:space="preserve">: ningún paciente aparece a la vez en train y test. En la Fase 4 se comprobó que el split por paciente no degrada el rendimiento (F1-macro 0.492 ± 0.018) y desde entonces es obligatorio. Desarrollo y ajuste se hacen con validación cruzada de 5 pliegues dentro del train; el test se toca una sola vez; el panel experto y el corpus ERSP actúan como evaluación externa.</w:t>
+      </w:r>
+    </w:p>
+    <w:bookmarkEnd w:id="16"/>
+    <w:bookmarkStart w:id="20" w:name="X83a24b85269e57e603e42aa75c0a5185f426457"/>
+    <w:p>
+      <w:pPr>
+        <w:pStyle w:val="Heading1"/>
+      </w:pPr>
+      <w:r>
+        <w:t xml:space="preserve">3. Proceso de obtención de la base de datos MIMIC-IV</w:t>
+      </w:r>
+    </w:p>
+    <w:p>
+      <w:pPr>
+        <w:pStyle w:val="FirstParagraph"/>
+      </w:pPr>
+      <w:r>
+        <w:t xml:space="preserve">MIMIC-IV no se descarga libremente: PhysioNet (MIT) exige acreditación personal, formación en ética de investigación y un acuerdo de uso de datos. El proceso completo, con fechas y tiempos, fue el siguiente.</w:t>
+      </w:r>
+    </w:p>
+    <w:p>
+      <w:pPr>
+        <w:pStyle w:val="CaptionedFigure"/>
+      </w:pPr>
+      <w:r>
+        <w:drawing>
+          <wp:inline>
+            <wp:extent cx="5120640" cy="3252894"/>
+            <wp:effectExtent b="0" l="0" r="0" t="0"/>
+            <wp:docPr descr="Proceso de obtención de MIMIC-IV: pasos, requisitos cumplidos y tiempos." title="" id="18" name="Picture"/>
+            <a:graphic>
+              <a:graphicData uri="http://schemas.openxmlformats.org/drawingml/2006/picture">
+                <pic:pic>
+                  <pic:nvPicPr>
+                    <pic:cNvPr descr="fig_acceso_mimic.png" id="19" name="Picture"/>
+                    <pic:cNvPicPr>
+                      <a:picLocks noChangeArrowheads="1" noChangeAspect="1"/>
+                    </pic:cNvPicPr>
+                  </pic:nvPicPr>
+                  <pic:blipFill>
+                    <a:blip r:embed="rId17"/>
+                    <a:stretch>
+                      <a:fillRect/>
+                    </a:stretch>
+                  </pic:blipFill>
+                  <pic:spPr bwMode="auto">
+                    <a:xfrm>
+                      <a:off x="0" y="0"/>
+                      <a:ext cx="5120640" cy="3252894"/>
+                    </a:xfrm>
+                    <a:prstGeom prst="rect">
+                      <a:avLst/>
+                    </a:prstGeom>
+                    <a:noFill/>
+                    <a:ln w="9525">
+                      <a:noFill/>
+                      <a:headEnd/>
+                      <a:tailEnd/>
+                    </a:ln>
+                  </pic:spPr>
+                </pic:pic>
+              </a:graphicData>
+            </a:graphic>
+          </wp:inline>
+        </w:drawing>
+      </w:r>
+    </w:p>
+    <w:p>
+      <w:pPr>
+        <w:pStyle w:val="ImageCaption"/>
+      </w:pPr>
+      <w:r>
+        <w:t xml:space="preserve">Proceso de obtención de MIMIC-IV: pasos, requisitos cumplidos y tiempos.</w:t>
+      </w:r>
+    </w:p>
+    <w:tbl>
+      <w:tblPr>
+        <w:tblStyle w:val="Table"/>
+        <w:tblW w:type="pct" w:w="5000"/>
+        <w:tblLayout w:type="fixed"/>
+        <w:tblLook w:firstRow="1" w:lastRow="0" w:firstColumn="0" w:lastColumn="0" w:noHBand="0" w:noVBand="0" w:val="0020"/>
+      </w:tblPr>
+      <w:tblGrid>
+        <w:gridCol w:w="1980"/>
+        <w:gridCol w:w="1980"/>
+        <w:gridCol w:w="1980"/>
+        <w:gridCol w:w="1980"/>
+      </w:tblGrid>
+      <w:tr>
+        <w:trPr>
+          <w:tblHeader w:val="on"/>
+        </w:trPr>
+        <w:tc>
+          <w:tcPr/>
+          <w:p>
+            <w:pPr>
+              <w:pStyle w:val="Compact"/>
+            </w:pPr>
+            <w:r>
+              <w:t xml:space="preserve">Paso</w:t>
+            </w:r>
+          </w:p>
+        </w:tc>
+        <w:tc>
+          <w:tcPr/>
+          <w:p>
+            <w:pPr>
+              <w:pStyle w:val="Compact"/>
+            </w:pPr>
+            <w:r>
+              <w:t xml:space="preserve">Fecha</w:t>
+            </w:r>
+          </w:p>
+        </w:tc>
+        <w:tc>
+          <w:tcPr/>
+          <w:p>
+            <w:pPr>
+              <w:pStyle w:val="Compact"/>
+            </w:pPr>
+            <w:r>
+              <w:t xml:space="preserve">Qué se hizo</w:t>
+            </w:r>
+          </w:p>
+        </w:tc>
+        <w:tc>
+          <w:tcPr/>
+          <w:p>
+            <w:pPr>
+              <w:pStyle w:val="Compact"/>
+            </w:pPr>
+            <w:r>
+              <w:t xml:space="preserve">Requisito que cubre</w:t>
+            </w:r>
+          </w:p>
+        </w:tc>
+      </w:tr>
+      <w:tr>
+        <w:tc>
+          <w:tcPr/>
+          <w:p>
+            <w:pPr>
+              <w:pStyle w:val="Compact"/>
+            </w:pPr>
+            <w:r>
+              <w:t xml:space="preserve">0. Decisión de la fuente</w:t>
+            </w:r>
+          </w:p>
+        </w:tc>
+        <w:tc>
+          <w:tcPr/>
+          <w:p>
+            <w:pPr>
+              <w:pStyle w:val="Compact"/>
+            </w:pPr>
+            <w:r>
+              <w:t xml:space="preserve">27–28 abr 2026</w:t>
+            </w:r>
+          </w:p>
+        </w:tc>
+        <w:tc>
+          <w:tcPr/>
+          <w:p>
+            <w:pPr>
+              <w:pStyle w:val="Compact"/>
+            </w:pPr>
+            <w:r>
+              <w:t xml:space="preserve">Sin acceso a historias clínicas de EsSalud, MIMIC-IV pasa de plan B a dataset principal</w:t>
+            </w:r>
+          </w:p>
+        </w:tc>
+        <w:tc>
+          <w:tcPr/>
+          <w:p>
+            <w:pPr>
+              <w:pStyle w:val="Compact"/>
+            </w:pPr>
+            <w:r>
+              <w:t xml:space="preserve">Viabilidad del proyecto</w:t>
+            </w:r>
+          </w:p>
+        </w:tc>
+      </w:tr>
+      <w:tr>
+        <w:tc>
+          <w:tcPr/>
+          <w:p>
+            <w:pPr>
+              <w:pStyle w:val="Compact"/>
+            </w:pPr>
+            <w:r>
+              <w:t xml:space="preserve">1. Registro en PhysioNet</w:t>
+            </w:r>
+          </w:p>
+        </w:tc>
+        <w:tc>
+          <w:tcPr/>
+          <w:p>
+            <w:pPr>
+              <w:pStyle w:val="Compact"/>
+            </w:pPr>
+            <w:r>
+              <w:t xml:space="preserve">28 abr 2026</w:t>
+            </w:r>
+          </w:p>
+        </w:tc>
+        <w:tc>
+          <w:tcPr/>
+          <w:p>
+            <w:pPr>
+              <w:pStyle w:val="Compact"/>
+            </w:pPr>
+            <w:r>
+              <w:t xml:space="preserve">Cuenta con nombre real y afiliación académica</w:t>
+            </w:r>
+          </w:p>
+        </w:tc>
+        <w:tc>
+          <w:tcPr/>
+          <w:p>
+            <w:pPr>
+              <w:pStyle w:val="Compact"/>
+            </w:pPr>
+            <w:r>
+              <w:t xml:space="preserve">Identidad y afiliación verificables</w:t>
+            </w:r>
+          </w:p>
+        </w:tc>
+      </w:tr>
+      <w:tr>
+        <w:tc>
+          <w:tcPr/>
+          <w:p>
+            <w:pPr>
+              <w:pStyle w:val="Compact"/>
+            </w:pPr>
+            <w:r>
+              <w:t xml:space="preserve">2. Certificación ética CITI</w:t>
+            </w:r>
+          </w:p>
+        </w:tc>
+        <w:tc>
+          <w:tcPr/>
+          <w:p>
+            <w:pPr>
+              <w:pStyle w:val="Compact"/>
+            </w:pPr>
+            <w:r>
+              <w:t xml:space="preserve">28 abr 2026</w:t>
+            </w:r>
+          </w:p>
+        </w:tc>
+        <w:tc>
+          <w:tcPr/>
+          <w:p>
+            <w:pPr>
+              <w:pStyle w:val="Compact"/>
+            </w:pPr>
+            <w:r>
+              <w:t xml:space="preserve">Curso «Data or Specimens Only Research» (MIT Affiliates), nota 95/100 (mínimo 90); segundo curso «Ética en Investigación» bajo EsSalud, nota 96/100. Ambos vigentes hasta el 28 abr 2029</w:t>
+            </w:r>
+          </w:p>
+        </w:tc>
+        <w:tc>
+          <w:tcPr/>
+          <w:p>
+            <w:pPr>
+              <w:pStyle w:val="Compact"/>
+            </w:pPr>
+            <w:r>
+              <w:t xml:space="preserve">Formación en protección de sujetos humanos y HIPAA</w:t>
+            </w:r>
+          </w:p>
+        </w:tc>
+      </w:tr>
+      <w:tr>
+        <w:tc>
+          <w:tcPr/>
+          <w:p>
+            <w:pPr>
+              <w:pStyle w:val="Compact"/>
+            </w:pPr>
+            <w:r>
+              <w:t xml:space="preserve">3. Solicitud de acceso y acuerdo de uso</w:t>
+            </w:r>
+          </w:p>
+        </w:tc>
+        <w:tc>
+          <w:tcPr/>
+          <w:p>
+            <w:pPr>
+              <w:pStyle w:val="Compact"/>
+            </w:pPr>
+            <w:r>
+              <w:t xml:space="preserve">28 abr 2026</w:t>
+            </w:r>
+          </w:p>
+        </w:tc>
+        <w:tc>
+          <w:tcPr/>
+          <w:p>
+            <w:pPr>
+              <w:pStyle w:val="Compact"/>
+            </w:pPr>
+            <w:r>
+              <w:t xml:space="preserve">Solicitud de</w:t>
+            </w:r>
+            <w:r>
+              <w:t xml:space="preserve"> </w:t>
+            </w:r>
+            <w:r>
+              <w:rPr>
+                <w:i/>
+                <w:iCs/>
+              </w:rPr>
+              <w:t xml:space="preserve">credentialed access</w:t>
+            </w:r>
+            <w:r>
+              <w:t xml:space="preserve"> </w:t>
+            </w:r>
+            <w:r>
+              <w:t xml:space="preserve">y firma del</w:t>
+            </w:r>
+            <w:r>
+              <w:t xml:space="preserve"> </w:t>
+            </w:r>
+            <w:r>
+              <w:rPr>
+                <w:i/>
+                <w:iCs/>
+              </w:rPr>
+              <w:t xml:space="preserve">Credentialed Health Data Use Agreement</w:t>
+            </w:r>
+            <w:r>
+              <w:t xml:space="preserve"> </w:t>
+            </w:r>
+            <w:r>
+              <w:t xml:space="preserve">v1.5.0 para MIMIC-IV v3.1</w:t>
+            </w:r>
+          </w:p>
+        </w:tc>
+        <w:tc>
+          <w:tcPr/>
+          <w:p>
+            <w:pPr>
+              <w:pStyle w:val="Compact"/>
+            </w:pPr>
+            <w:r>
+              <w:t xml:space="preserve">No reidentificar, no redistribuir, no compartir texto, citar el DOI</w:t>
+            </w:r>
+          </w:p>
+        </w:tc>
+      </w:tr>
+      <w:tr>
+        <w:tc>
+          <w:tcPr/>
+          <w:p>
+            <w:pPr>
+              <w:pStyle w:val="Compact"/>
+            </w:pPr>
+            <w:r>
+              <w:t xml:space="preserve">4. Acceso confirmado a MIMIC-IV v3.1</w:t>
+            </w:r>
+          </w:p>
+        </w:tc>
+        <w:tc>
+          <w:tcPr/>
+          <w:p>
+            <w:pPr>
+              <w:pStyle w:val="Compact"/>
+            </w:pPr>
+            <w:r>
+              <w:t xml:space="preserve">28 abr 2026</w:t>
+            </w:r>
+          </w:p>
+        </w:tc>
+        <w:tc>
+          <w:tcPr/>
+          <w:p>
+            <w:pPr>
+              <w:pStyle w:val="Compact"/>
+            </w:pPr>
+            <w:r>
+              <w:t xml:space="preserve">Módulos hosp e icu: 364 627 pacientes, 546 028 hospitalizaciones, 94 458 estancias en UCI (DOI 10.13026/kpb9-mt58)</w:t>
+            </w:r>
+          </w:p>
+        </w:tc>
+        <w:tc>
+          <w:tcPr/>
+          <w:p>
+            <w:pPr>
+              <w:pStyle w:val="Compact"/>
+            </w:pPr>
+            <w:r>
+              <w:t xml:space="preserve">Acceso otorgado</w:t>
+            </w:r>
+          </w:p>
+        </w:tc>
+      </w:tr>
+      <w:tr>
+        <w:tc>
+          <w:tcPr/>
+          <w:p>
+            <w:pPr>
+              <w:pStyle w:val="Compact"/>
+            </w:pPr>
+            <w:r>
+              <w:t xml:space="preserve">5. Acuerdo específico de MIMIC-IV-Note v2.2</w:t>
+            </w:r>
+          </w:p>
+        </w:tc>
+        <w:tc>
+          <w:tcPr/>
+          <w:p>
+            <w:pPr>
+              <w:pStyle w:val="Compact"/>
+            </w:pPr>
+            <w:r>
+              <w:t xml:space="preserve">10–11 may 2026</w:t>
+            </w:r>
+          </w:p>
+        </w:tc>
+        <w:tc>
+          <w:tcPr/>
+          <w:p>
+            <w:pPr>
+              <w:pStyle w:val="Compact"/>
+            </w:pPr>
+            <w:r>
+              <w:t xml:space="preserve">Las notas clínicas tienen su propio acuerdo de uso (DOI 10.13026/1n74-ne17); descarga de 4 archivos comprimidos = 1.96 GB (epicrisis 1.14 GB; radiología 781 MB; dos archivos de metadatos)</w:t>
+            </w:r>
+          </w:p>
+        </w:tc>
+        <w:tc>
+          <w:tcPr/>
+          <w:p>
+            <w:pPr>
+              <w:pStyle w:val="Compact"/>
+            </w:pPr>
+            <w:r>
+              <w:t xml:space="preserve">Acceso al texto libre</w:t>
+            </w:r>
+          </w:p>
+        </w:tc>
+      </w:tr>
+      <w:tr>
+        <w:tc>
+          <w:tcPr/>
+          <w:p>
+            <w:pPr>
+              <w:pStyle w:val="Compact"/>
+            </w:pPr>
+            <w:r>
+              <w:t xml:space="preserve">6. Entorno y primera lectura</w:t>
+            </w:r>
+          </w:p>
+        </w:tc>
+        <w:tc>
+          <w:tcPr/>
+          <w:p>
+            <w:pPr>
+              <w:pStyle w:val="Compact"/>
+            </w:pPr>
+            <w:r>
+              <w:t xml:space="preserve">11 may 2026</w:t>
+            </w:r>
+          </w:p>
+        </w:tc>
+        <w:tc>
+          <w:tcPr/>
+          <w:p>
+            <w:pPr>
+              <w:pStyle w:val="Compact"/>
+            </w:pPr>
+            <w:r>
+              <w:t xml:space="preserve">Python 3.13.5 + DuckDB 1.5.2 leen los archivos comprimidos sin cargarlos a memoria; consulta de verificación: 331 793 epicrisis, 100 % del tipo</w:t>
+            </w:r>
+            <w:r>
+              <w:t xml:space="preserve"> </w:t>
+            </w:r>
+            <w:r>
+              <w:rPr>
+                <w:i/>
+                <w:iCs/>
+              </w:rPr>
+              <w:t xml:space="preserve">discharge summary</w:t>
+            </w:r>
+            <w:r>
+              <w:t xml:space="preserve">, consistente con el artículo oficial del dataset</w:t>
+            </w:r>
+          </w:p>
+        </w:tc>
+        <w:tc>
+          <w:tcPr/>
+          <w:p>
+            <w:pPr>
+              <w:pStyle w:val="Compact"/>
+            </w:pPr>
+            <w:r>
+              <w:t xml:space="preserve">Lectura reproducible</w:t>
+            </w:r>
+          </w:p>
+        </w:tc>
+      </w:tr>
+      <w:tr>
+        <w:tc>
+          <w:tcPr/>
+          <w:p>
+            <w:pPr>
+              <w:pStyle w:val="Compact"/>
+            </w:pPr>
+            <w:r>
+              <w:t xml:space="preserve">7. Integridad del dataset completo</w:t>
+            </w:r>
+          </w:p>
+        </w:tc>
+        <w:tc>
+          <w:tcPr/>
+          <w:p>
+            <w:pPr>
+              <w:pStyle w:val="Compact"/>
+            </w:pPr>
+            <w:r>
+              <w:t xml:space="preserve">14 may 2026</w:t>
+            </w:r>
+          </w:p>
+        </w:tc>
+        <w:tc>
+          <w:tcPr/>
+          <w:p>
+            <w:pPr>
+              <w:pStyle w:val="Compact"/>
+            </w:pPr>
+            <w:r>
+              <w:t xml:space="preserve">Descarga y descompresión de los 33 archivos de MIMIC-IV v3.1; verificación SHA-256 contra el listado oficial: 33/33 íntegros; datos en disco local y excluidos del control de versiones</w:t>
+            </w:r>
+          </w:p>
+        </w:tc>
+        <w:tc>
+          <w:tcPr/>
+          <w:p>
+            <w:pPr>
+              <w:pStyle w:val="Compact"/>
+            </w:pPr>
+            <w:r>
+              <w:t xml:space="preserve">Integridad y cumplimiento del acuerdo</w:t>
+            </w:r>
+          </w:p>
+        </w:tc>
+      </w:tr>
+    </w:tbl>
+    <w:p>
+      <w:pPr>
+        <w:pStyle w:val="BodyText"/>
+      </w:pPr>
       <w:r>
         <w:rPr>
-          <w:rStyle w:val="VerbatimChar"/>
+          <w:b/>
+          <w:bCs/>
         </w:rPr>
-        <w:t xml:space="preserve">subject_id</w:t>
-      </w:r>
-      <w:r>
-        <w:t xml:space="preserve"> </w:t>
-      </w:r>
-      <w:r>
-        <w:t xml:space="preserve">aparece a la vez en train y test. En la Fase 4 se comprobó que el split por paciente no degrada el rendimiento (F1-macro 0.492 ± 0.018) y desde entonces es obligatorio (</w:t>
+        <w:t xml:space="preserve">Tiempos.</w:t>
+      </w:r>
+      <w:r>
+        <w:t xml:space="preserve"> </w:t>
+      </w:r>
+      <w:r>
+        <w:t xml:space="preserve">Registro, cursos de ética, acuerdo de uso y acceso a MIMIC-IV:</w:t>
+      </w:r>
+      <w:r>
+        <w:t xml:space="preserve"> </w:t>
       </w:r>
       <w:r>
         <w:rPr>
-          <w:rStyle w:val="VerbatimChar"/>
+          <w:b/>
+          <w:bCs/>
         </w:rPr>
-        <w:t xml:space="preserve">fase4/RESULTADOS_FASE4.md</w:t>
-      </w:r>
-      <w:r>
-        <w:t xml:space="preserve">). Desarrollo y ajuste se hacen con validación cruzada de 5 pliegues dentro del train; el test se toca una sola vez; el panel experto y el corpus ERSP actúan como evaluación externa.</w:t>
-      </w:r>
-    </w:p>
-    <w:bookmarkEnd w:id="13"/>
-    <w:bookmarkStart w:id="14" w:name="X7a489f429bc6ac4f4b8abba25b515ce994c4053"/>
+        <w:t xml:space="preserve">1 día</w:t>
+      </w:r>
+      <w:r>
+        <w:t xml:space="preserve"> </w:t>
+      </w:r>
+      <w:r>
+        <w:t xml:space="preserve">(28 de abril de 2026). Desde el acceso principal hasta el acuerdo de notas y la descarga de 1.96 GB:</w:t>
+      </w:r>
+      <w:r>
+        <w:t xml:space="preserve"> </w:t>
+      </w:r>
+      <w:r>
+        <w:rPr>
+          <w:b/>
+          <w:bCs/>
+        </w:rPr>
+        <w:t xml:space="preserve">13 días</w:t>
+      </w:r>
+      <w:r>
+        <w:t xml:space="preserve">. Desde la decisión del dataset hasta el corpus completo verificado:</w:t>
+      </w:r>
+      <w:r>
+        <w:t xml:space="preserve"> </w:t>
+      </w:r>
+      <w:r>
+        <w:rPr>
+          <w:b/>
+          <w:bCs/>
+        </w:rPr>
+        <w:t xml:space="preserve">17 días</w:t>
+      </w:r>
+      <w:r>
+        <w:t xml:space="preserve"> </w:t>
+      </w:r>
+      <w:r>
+        <w:t xml:space="preserve">(27 de abril al 14 de mayo).</w:t>
+      </w:r>
+      <w:r>
+        <w:t xml:space="preserve"> </w:t>
+      </w:r>
+      <w:r>
+        <w:rPr>
+          <w:b/>
+          <w:bCs/>
+        </w:rPr>
+        <w:t xml:space="preserve">Costo:</w:t>
+      </w:r>
+      <w:r>
+        <w:t xml:space="preserve"> </w:t>
+      </w:r>
+      <w:r>
+        <w:t xml:space="preserve">S/ 0; el acceso es gratuito con acreditación.</w:t>
+      </w:r>
+    </w:p>
+    <w:p>
+      <w:pPr>
+        <w:pStyle w:val="BodyText"/>
+      </w:pPr>
+      <w:r>
+        <w:rPr>
+          <w:b/>
+          <w:bCs/>
+        </w:rPr>
+        <w:t xml:space="preserve">Requisitos adicionales que el proyecto se impuso:</w:t>
+      </w:r>
+      <w:r>
+        <w:t xml:space="preserve"> </w:t>
+      </w:r>
+      <w:r>
+        <w:t xml:space="preserve">segunda certificación ética bajo EsSalud (no exigida por PhysioNet, añadida por la afiliación institucional del autor); declaración explícita de conflicto de interés (autor del Modelo GEMSES y ex directivo de la instancia de EsSalud que emite la Directiva); acceso al texto de MIMIC-IV restringido al investigador principal, único acreditado; y exclusión de todo dato, modelo entrenado y copia de trabajo del repositorio de código.</w:t>
+      </w:r>
+    </w:p>
+    <w:bookmarkEnd w:id="20"/>
+    <w:bookmarkStart w:id="21" w:name="X7a489f429bc6ac4f4b8abba25b515ce994c4053"/>
     <w:p>
       <w:pPr>
         <w:pStyle w:val="Heading1"/>
       </w:pPr>
       <w:r>
-        <w:t xml:space="preserve">3. Baseline, familia de modelos y alternativas ya descartadas</w:t>
+        <w:t xml:space="preserve">4. Baseline, familia de modelos y alternativas ya descartadas</w:t>
       </w:r>
     </w:p>
     <w:p>
@@ -926,7 +1428,7 @@
         <w:t xml:space="preserve"> </w:t>
       </w:r>
       <w:r>
-        <w:t xml:space="preserve">reglas regex Tier B + NegEx, precisión 65.7 % (IC95 54.0–75.8, n = 70, reporte de validación de 70 eventos), y TF-IDF + regresión logística (Fase 4).</w:t>
+        <w:t xml:space="preserve">reglas regex Tier B + NegEx, precisión 65.7 % (IC95 54.0–75.8, n = 70, validación experta de mayo), y TF-IDF + regresión logística (Fase 4).</w:t>
       </w:r>
     </w:p>
     <w:p>
@@ -970,25 +1472,7 @@
         <w:t xml:space="preserve"> </w:t>
       </w:r>
       <w:r>
-        <w:t xml:space="preserve">con la misma partición y semilla (hipótesis HE2): ClinicalBERT congelado F1-macro 0.19; Bio_ClinicalBERT y BioBERT con ajuste fino en GPU 0.21–0.35 (2.9–4.0 h) frente a 0.459 del lineal en 48 s (</w:t>
-      </w:r>
-      <w:r>
-        <w:rPr>
-          <w:rStyle w:val="VerbatimChar"/>
-        </w:rPr>
-        <w:t xml:space="preserve">resultados_transformers.json</w:t>
-      </w:r>
-      <w:r>
-        <w:t xml:space="preserve">); BioClinical ModernBERT con ventana de 1024 tokens 0.428 tras 42.5 h de GPU (</w:t>
-      </w:r>
-      <w:r>
-        <w:rPr>
-          <w:rStyle w:val="VerbatimChar"/>
-        </w:rPr>
-        <w:t xml:space="preserve">modernbert_final.json</w:t>
-      </w:r>
-      <w:r>
-        <w:t xml:space="preserve">); Llama 3.2 3B</w:t>
+        <w:t xml:space="preserve">con la misma partición y semilla (hipótesis HE2): ClinicalBERT congelado F1-macro 0.19; Bio_ClinicalBERT y BioBERT con ajuste fino en GPU 0.21–0.35 (2.9–4.0 h) frente a 0.459 del lineal en 48 s; BioClinical ModernBERT con ventana de 1024 tokens 0.428 tras 42.5 h de GPU; Llama 3.2 3B</w:t>
       </w:r>
       <w:r>
         <w:t xml:space="preserve"> </w:t>
@@ -1004,29 +1488,17 @@
         <w:t xml:space="preserve"> </w:t>
       </w:r>
       <w:r>
-        <w:t xml:space="preserve">kappa 0.0 (dice sí a todo,</w:t>
-      </w:r>
-      <w:r>
-        <w:t xml:space="preserve"> </w:t>
-      </w:r>
-      <w:r>
-        <w:rPr>
-          <w:rStyle w:val="VerbatimChar"/>
-        </w:rPr>
-        <w:t xml:space="preserve">llm_local_vs_experto.json</w:t>
-      </w:r>
-      <w:r>
-        <w:t xml:space="preserve">). Causa medida: la ventana de 256 tokens cubre el 9 % de una epicrisis (mediana 3 148 tokens). Se documenta como resultado negativo; solo se reabriría con Longformer o BigBird y GPU dedicada.</w:t>
-      </w:r>
-    </w:p>
-    <w:bookmarkEnd w:id="14"/>
-    <w:bookmarkStart w:id="15" w:name="criterio-preliminar-de-evaluación"/>
+        <w:t xml:space="preserve">kappa 0.0 (dice sí a todo). Causa medida: la ventana de 256 tokens cubre el 9 % de una epicrisis (mediana 3 148 tokens). Se documenta como resultado negativo; solo se reabriría con Longformer o BigBird y GPU dedicada.</w:t>
+      </w:r>
+    </w:p>
+    <w:bookmarkEnd w:id="21"/>
+    <w:bookmarkStart w:id="22" w:name="criterio-preliminar-de-evaluación"/>
     <w:p>
       <w:pPr>
         <w:pStyle w:val="Heading1"/>
       </w:pPr>
       <w:r>
-        <w:t xml:space="preserve">4. Criterio preliminar de evaluación</w:t>
+        <w:t xml:space="preserve">5. Criterio preliminar de evaluación</w:t>
       </w:r>
     </w:p>
     <w:tbl>
@@ -1129,16 +1601,7 @@
               <w:pStyle w:val="Compact"/>
             </w:pPr>
             <w:r>
-              <w:t xml:space="preserve">0.363 en cascada frente a 0.536 de E2 aislada (</w:t>
-            </w:r>
-            <w:r>
-              <w:rPr>
-                <w:rStyle w:val="VerbatimChar"/>
-              </w:rPr>
-              <w:t xml:space="preserve">metricas_corregidas.json</w:t>
-            </w:r>
-            <w:r>
-              <w:t xml:space="preserve">)</w:t>
+              <w:t xml:space="preserve">0.363 en cascada frente a 0.536 de E2 aislada</w:t>
             </w:r>
           </w:p>
         </w:tc>
@@ -1217,19 +1680,7 @@
               <w:t xml:space="preserve"> </w:t>
             </w:r>
             <w:r>
-              <w:t xml:space="preserve">kappa sistema–experto ≥ 0.61 (umbral de la hipótesis general,</w:t>
-            </w:r>
-            <w:r>
-              <w:t xml:space="preserve"> </w:t>
-            </w:r>
-            <w:r>
-              <w:rPr>
-                <w:rStyle w:val="VerbatimChar"/>
-              </w:rPr>
-              <w:t xml:space="preserve">Capitulo3.tex:321</w:t>
-            </w:r>
-            <w:r>
-              <w:t xml:space="preserve">)</w:t>
+              <w:t xml:space="preserve">kappa sistema–experto ≥ 0.61 (umbral fijado en la hipótesis general del proyecto)</w:t>
             </w:r>
           </w:p>
         </w:tc>
@@ -1334,14 +1785,14 @@
         <w:t xml:space="preserve">Toda comparación entre modelos se hace con la misma partición (semilla 42, por paciente) y se reporta siempre la cascada, porque el pipeline completo rinde menos que sus etapas.</w:t>
       </w:r>
     </w:p>
-    <w:bookmarkEnd w:id="15"/>
-    <w:bookmarkStart w:id="16" w:name="reproducibilidad"/>
+    <w:bookmarkEnd w:id="22"/>
+    <w:bookmarkStart w:id="23" w:name="reproducibilidad"/>
     <w:p>
       <w:pPr>
         <w:pStyle w:val="Heading1"/>
       </w:pPr>
       <w:r>
-        <w:t xml:space="preserve">5. Reproducibilidad</w:t>
+        <w:t xml:space="preserve">6. Reproducibilidad</w:t>
       </w:r>
     </w:p>
     <w:p>
@@ -1379,19 +1830,7 @@
         <w:t xml:space="preserve"> </w:t>
       </w:r>
       <w:r>
-        <w:t xml:space="preserve">en</w:t>
-      </w:r>
-      <w:r>
-        <w:t xml:space="preserve"> </w:t>
-      </w:r>
-      <w:r>
-        <w:rPr>
-          <w:rStyle w:val="VerbatimChar"/>
-        </w:rPr>
-        <w:t xml:space="preserve">requirements.txt</w:t>
-      </w:r>
-      <w:r>
-        <w:t xml:space="preserve">.</w:t>
+        <w:t xml:space="preserve">en el archivo de dependencias.</w:t>
       </w:r>
     </w:p>
     <w:p>
@@ -1426,31 +1865,7 @@
         <w:t xml:space="preserve">bootstrap</w:t>
       </w:r>
       <w:r>
-        <w:t xml:space="preserve"> </w:t>
-      </w:r>
-      <w:r>
-        <w:t xml:space="preserve">(</w:t>
-      </w:r>
-      <w:r>
-        <w:rPr>
-          <w:rStyle w:val="VerbatimChar"/>
-        </w:rPr>
-        <w:t xml:space="preserve">SEED = 42</w:t>
-      </w:r>
-      <w:r>
-        <w:t xml:space="preserve">,</w:t>
-      </w:r>
-      <w:r>
-        <w:t xml:space="preserve"> </w:t>
-      </w:r>
-      <w:r>
-        <w:rPr>
-          <w:rStyle w:val="VerbatimChar"/>
-        </w:rPr>
-        <w:t xml:space="preserve">fase9_modelo_final.py:93</w:t>
-      </w:r>
-      <w:r>
-        <w:t xml:space="preserve">).</w:t>
+        <w:t xml:space="preserve">.</w:t>
       </w:r>
     </w:p>
     <w:p>
@@ -1472,46 +1887,7 @@
         <w:t xml:space="preserve"> </w:t>
       </w:r>
       <w:r>
-        <w:t xml:space="preserve">un JSON de resultados por fase en</w:t>
-      </w:r>
-      <w:r>
-        <w:t xml:space="preserve"> </w:t>
-      </w:r>
-      <w:r>
-        <w:rPr>
-          <w:rStyle w:val="VerbatimChar"/>
-        </w:rPr>
-        <w:t xml:space="preserve">datos_intermedios/fase*/</w:t>
-      </w:r>
-      <w:r>
-        <w:t xml:space="preserve">, más bitácoras fechadas en</w:t>
-      </w:r>
-      <w:r>
-        <w:t xml:space="preserve"> </w:t>
-      </w:r>
-      <w:r>
-        <w:rPr>
-          <w:rStyle w:val="VerbatimChar"/>
-        </w:rPr>
-        <w:t xml:space="preserve">07_bitacoras/</w:t>
-      </w:r>
-      <w:r>
-        <w:t xml:space="preserve">. Cada cifra del borrador de tesis lleva un comentario</w:t>
-      </w:r>
-      <w:r>
-        <w:t xml:space="preserve"> </w:t>
-      </w:r>
-      <w:r>
-        <w:rPr>
-          <w:rStyle w:val="VerbatimChar"/>
-        </w:rPr>
-        <w:t xml:space="preserve">% fuente:</w:t>
-      </w:r>
-      <w:r>
-        <w:t xml:space="preserve"> </w:t>
-      </w:r>
-      <w:r>
-        <w:t xml:space="preserve">con su archivo.</w:t>
+        <w:t xml:space="preserve">un archivo JSON de resultados por fase, más bitácoras fechadas por sesión. Cada cifra del borrador de tesis lleva un comentario con el archivo del que proviene, verificado por script.</w:t>
       </w:r>
     </w:p>
     <w:p>
@@ -1533,49 +1909,7 @@
         <w:t xml:space="preserve"> </w:t>
       </w:r>
       <w:r>
-        <w:rPr>
-          <w:rStyle w:val="VerbatimChar"/>
-        </w:rPr>
-        <w:t xml:space="preserve">modelo_final.pkl</w:t>
-      </w:r>
-      <w:r>
-        <w:t xml:space="preserve">,</w:t>
-      </w:r>
-      <w:r>
-        <w:t xml:space="preserve"> </w:t>
-      </w:r>
-      <w:r>
-        <w:rPr>
-          <w:rStyle w:val="VerbatimChar"/>
-        </w:rPr>
-        <w:t xml:space="preserve">dataset_final.parquet</w:t>
-      </w:r>
-      <w:r>
-        <w:t xml:space="preserve">,</w:t>
-      </w:r>
-      <w:r>
-        <w:t xml:space="preserve"> </w:t>
-      </w:r>
-      <w:r>
-        <w:rPr>
-          <w:rStyle w:val="VerbatimChar"/>
-        </w:rPr>
-        <w:t xml:space="preserve">resultados_finales.json</w:t>
-      </w:r>
-      <w:r>
-        <w:t xml:space="preserve">,</w:t>
-      </w:r>
-      <w:r>
-        <w:t xml:space="preserve"> </w:t>
-      </w:r>
-      <w:r>
-        <w:rPr>
-          <w:rStyle w:val="VerbatimChar"/>
-        </w:rPr>
-        <w:t xml:space="preserve">metricas_corregidas.json</w:t>
-      </w:r>
-      <w:r>
-        <w:t xml:space="preserve">. Modelo y datos quedan fuera de git por el DUA; el repositorio de la tesis es privado desde el 28-jul-2026.</w:t>
+        <w:t xml:space="preserve">modelo final serializado, conjunto de datos final (Parquet), JSON de resultados finales y JSON de métricas corregidas. Modelo y datos quedan fuera de git por el acuerdo de uso; el repositorio de la tesis es privado desde el 28-jul-2026.</w:t>
       </w:r>
     </w:p>
     <w:p>
@@ -1591,79 +1925,13 @@
           <w:b/>
           <w:bCs/>
         </w:rPr>
-        <w:t xml:space="preserve">Estado honesto (verificado en disco el 25-set-2026):</w:t>
-      </w:r>
-      <w:r>
-        <w:t xml:space="preserve"> </w:t>
-      </w:r>
-      <w:r>
-        <w:t xml:space="preserve">no existen</w:t>
-      </w:r>
-      <w:r>
-        <w:t xml:space="preserve"> </w:t>
-      </w:r>
-      <w:r>
-        <w:rPr>
-          <w:rStyle w:val="VerbatimChar"/>
-        </w:rPr>
-        <w:t xml:space="preserve">requirements.txt</w:t>
-      </w:r>
-      <w:r>
-        <w:t xml:space="preserve">,</w:t>
-      </w:r>
-      <w:r>
-        <w:t xml:space="preserve"> </w:t>
-      </w:r>
-      <w:r>
-        <w:rPr>
-          <w:rStyle w:val="VerbatimChar"/>
-        </w:rPr>
-        <w:t xml:space="preserve">.env.example</w:t>
-      </w:r>
-      <w:r>
-        <w:t xml:space="preserve">,</w:t>
-      </w:r>
-      <w:r>
-        <w:t xml:space="preserve"> </w:t>
-      </w:r>
-      <w:r>
-        <w:rPr>
-          <w:rStyle w:val="VerbatimChar"/>
-        </w:rPr>
-        <w:t xml:space="preserve">run_pipeline.py</w:t>
-      </w:r>
-      <w:r>
-        <w:t xml:space="preserve"> </w:t>
-      </w:r>
-      <w:r>
-        <w:t xml:space="preserve">ni</w:t>
-      </w:r>
-      <w:r>
-        <w:t xml:space="preserve"> </w:t>
-      </w:r>
-      <w:r>
-        <w:rPr>
-          <w:rStyle w:val="VerbatimChar"/>
-        </w:rPr>
-        <w:t xml:space="preserve">data/raw</w:t>
-      </w:r>
-      <w:r>
-        <w:t xml:space="preserve"> </w:t>
-      </w:r>
-      <w:r>
-        <w:t xml:space="preserve">y</w:t>
-      </w:r>
-      <w:r>
-        <w:t xml:space="preserve"> </w:t>
-      </w:r>
-      <w:r>
-        <w:rPr>
-          <w:rStyle w:val="VerbatimChar"/>
-        </w:rPr>
-        <w:t xml:space="preserve">data/processed</w:t>
-      </w:r>
-      <w:r>
-        <w:t xml:space="preserve">; hay 46 scripts, uno por fase, sin orquestador; la sección</w:t>
+        <w:t xml:space="preserve">Estado honesto (verificado el 25-set-2026):</w:t>
+      </w:r>
+      <w:r>
+        <w:t xml:space="preserve"> </w:t>
+      </w:r>
+      <w:r>
+        <w:t xml:space="preserve">no existe aún un archivo de dependencias con versiones fijadas, ni plantilla de variables de entorno, ni un orquestador que encadene las fases, ni la estructura data/raw y data/processed; hay 46 scripts, uno por fase; la sección</w:t>
       </w:r>
       <w:r>
         <w:t xml:space="preserve"> </w:t>
@@ -1710,14 +1978,14 @@
         <w:t xml:space="preserve">= cerrar exactamente esto, con criterio de aceptación medible: que un tercero con credencial PhysioNet regenere la Fase 9 con un solo comando y obtenga sens 0.7623, esp 0.7699 y AUC 0.8426 con tolerancia ± 0.005.</w:t>
       </w:r>
     </w:p>
-    <w:bookmarkEnd w:id="16"/>
-    <w:bookmarkStart w:id="17" w:name="Xb82c3b42f188a5a28afc4a28647cfe89e93b4c6"/>
+    <w:bookmarkEnd w:id="23"/>
+    <w:bookmarkStart w:id="24" w:name="Xb82c3b42f188a5a28afc4a28647cfe89e93b4c6"/>
     <w:p>
       <w:pPr>
         <w:pStyle w:val="Heading1"/>
       </w:pPr>
       <w:r>
-        <w:t xml:space="preserve">6. Riesgos técnicos previsibles y cómo se detectan o mitigan</w:t>
+        <w:t xml:space="preserve">7. Riesgos técnicos previsibles y cómo se detectan o mitigan</w:t>
       </w:r>
     </w:p>
     <w:tbl>
@@ -1870,32 +2138,7 @@
               <w:pStyle w:val="Compact"/>
             </w:pPr>
             <w:r>
-              <w:t xml:space="preserve">Partición por</w:t>
-            </w:r>
-            <w:r>
-              <w:t xml:space="preserve"> </w:t>
-            </w:r>
-            <w:r>
-              <w:rPr>
-                <w:rStyle w:val="VerbatimChar"/>
-              </w:rPr>
-              <w:t xml:space="preserve">subject_id</w:t>
-            </w:r>
-            <w:r>
-              <w:t xml:space="preserve"> </w:t>
-            </w:r>
-            <w:r>
-              <w:t xml:space="preserve">con</w:t>
-            </w:r>
-            <w:r>
-              <w:t xml:space="preserve"> </w:t>
-            </w:r>
-            <w:r>
-              <w:rPr>
-                <w:i/>
-                <w:iCs/>
-              </w:rPr>
-              <w:t xml:space="preserve">assert</w:t>
+              <w:t xml:space="preserve">Partición por paciente con verificación automática</w:t>
             </w:r>
           </w:p>
         </w:tc>
@@ -2094,28 +2337,18 @@
               <w:pStyle w:val="Compact"/>
             </w:pPr>
             <w:r>
-              <w:t xml:space="preserve">DUA PhysioNet; incidente del 28-jul (repo público con DNI de ERSP)</w:t>
-            </w:r>
-          </w:p>
-        </w:tc>
-        <w:tc>
-          <w:tcPr/>
-          <w:p>
-            <w:pPr>
-              <w:pStyle w:val="Compact"/>
-            </w:pPr>
-            <w:r>
-              <w:t xml:space="preserve">Modelo y datos fuera de git; repo privado e historial reescrito; ticket a GitHub y aviso al DPO de EsSalud</w:t>
-            </w:r>
-            <w:r>
-              <w:t xml:space="preserve"> </w:t>
-            </w:r>
-            <w:r>
-              <w:rPr>
-                <w:b/>
-                <w:bCs/>
-              </w:rPr>
-              <w:t xml:space="preserve">pendientes</w:t>
+              <w:t xml:space="preserve">Acuerdo de uso PhysioNet; incidente del 28-jul con datos personales del corpus ERSP</w:t>
+            </w:r>
+          </w:p>
+        </w:tc>
+        <w:tc>
+          <w:tcPr/>
+          <w:p>
+            <w:pPr>
+              <w:pStyle w:val="Compact"/>
+            </w:pPr>
+            <w:r>
+              <w:t xml:space="preserve">Modelo y datos fuera de git; repositorio privado e historial reescrito; comunicaciones formales pendientes</w:t>
             </w:r>
           </w:p>
         </w:tc>
@@ -2172,14 +2405,14 @@
         </w:tc>
       </w:tr>
     </w:tbl>
-    <w:bookmarkEnd w:id="17"/>
-    <w:bookmarkStart w:id="18" w:name="verificación-contra-la-guía-sección-11"/>
+    <w:bookmarkEnd w:id="24"/>
+    <w:bookmarkStart w:id="25" w:name="verificación-contra-la-guía-sección-11"/>
     <w:p>
       <w:pPr>
         <w:pStyle w:val="Heading1"/>
       </w:pPr>
       <w:r>
-        <w:t xml:space="preserve">7. Verificación contra la guía (sección 11)</w:t>
+        <w:t xml:space="preserve">8. Verificación contra la guía (sección 11)</w:t>
       </w:r>
     </w:p>
     <w:p>
@@ -2187,7 +2420,7 @@
         <w:pStyle w:val="FirstParagraph"/>
       </w:pPr>
       <w:r>
-        <w:t xml:space="preserve">Diagrama acorde al tipo de tesis, entradas y salidas por etapa, criterio de resultado correcto, registro para reproducir, separación desarrollo/evaluación y riesgos (diez): cubiertos en las secciones 1 a 6. Alcance ejecutable con los recursos del curso:</w:t>
+        <w:t xml:space="preserve">Diagrama acorde al tipo de tesis, entradas y salidas por etapa, criterio de resultado correcto, registro para reproducir, separación desarrollo/evaluación y riesgos (diez): cubiertos en las secciones 1 a 7. Alcance ejecutable con los recursos del curso:</w:t>
       </w:r>
       <w:r>
         <w:t xml:space="preserve"> </w:t>
@@ -2203,88 +2436,10 @@
         <w:t xml:space="preserve"> </w:t>
       </w:r>
       <w:r>
-        <w:t xml:space="preserve">sí, porque el modelo ya existe y el Sprint 1 es de reproducibilidad, no de modelado.</w:t>
-      </w:r>
-    </w:p>
-    <w:p>
-      <w:pPr>
-        <w:pStyle w:val="BodyText"/>
-      </w:pPr>
-      <w:r>
-        <w:rPr>
-          <w:b/>
-          <w:bCs/>
-        </w:rPr>
-        <w:t xml:space="preserve">Fuentes abiertas para este entregable</w:t>
-      </w:r>
-      <w:r>
-        <w:t xml:space="preserve"> </w:t>
-      </w:r>
-      <w:r>
-        <w:t xml:space="preserve">(todas en el repositorio de la tesis tesis-gemses-mimic-pipeline):</w:t>
-      </w:r>
-    </w:p>
-    <w:p>
-      <w:pPr>
-        <w:pStyle w:val="Compact"/>
-        <w:numPr>
-          <w:ilvl w:val="0"/>
-          <w:numId w:val="1003"/>
-        </w:numPr>
-      </w:pPr>
-      <w:r>
-        <w:t xml:space="preserve">11_proyecto_II: 01_INVENTARIO_MODELOS_Y_CHECKLIST_2026-09-18.md</w:t>
-      </w:r>
-    </w:p>
-    <w:p>
-      <w:pPr>
-        <w:pStyle w:val="Compact"/>
-        <w:numPr>
-          <w:ilvl w:val="0"/>
-          <w:numId w:val="1003"/>
-        </w:numPr>
-      </w:pPr>
-      <w:r>
-        <w:t xml:space="preserve">11_proyecto_II: 02_ESTADO_DE_AVANCE_COMPLETO_2026-09-18.md</w:t>
-      </w:r>
-    </w:p>
-    <w:p>
-      <w:pPr>
-        <w:pStyle w:val="Compact"/>
-        <w:numPr>
-          <w:ilvl w:val="0"/>
-          <w:numId w:val="1003"/>
-        </w:numPr>
-      </w:pPr>
-      <w:r>
-        <w:t xml:space="preserve">04_pipeline_codigo: fase9_modelo_final.py, fase10_metricas_corregidas.py y los JSON de datos_intermedios.</w:t>
-      </w:r>
-    </w:p>
-    <w:p>
-      <w:pPr>
-        <w:pStyle w:val="Compact"/>
-        <w:numPr>
-          <w:ilvl w:val="0"/>
-          <w:numId w:val="1003"/>
-        </w:numPr>
-      </w:pPr>
-      <w:r>
-        <w:t xml:space="preserve">latex_tesis: Capitulo3.tex (hipótesis y umbral de kappa).</w:t>
-      </w:r>
-    </w:p>
-    <w:p>
-      <w:pPr>
-        <w:pStyle w:val="Compact"/>
-        <w:numPr>
-          <w:ilvl w:val="0"/>
-          <w:numId w:val="1003"/>
-        </w:numPr>
-      </w:pPr>
-      <w:r>
-        <w:t xml:space="preserve">Directiva N.º 7-OGCyH-ESSALUD-2020 (RGG 402-GG-ESSALUD-2020), Anexos 02 y 03.</w:t>
-      </w:r>
-    </w:p>
-    <w:bookmarkEnd w:id="18"/>
+        <w:t xml:space="preserve">sí, porque el modelo ya existe, el acceso a los datos está vigente hasta 2029 y el Sprint 1 es de reproducibilidad, no de modelado.</w:t>
+      </w:r>
+    </w:p>
+    <w:bookmarkEnd w:id="25"/>
     <w:sectPr>
       <w:footnotePr>
         <w:numRestart w:val="eachSect"/>
@@ -2505,9 +2660,6 @@
     <w:abstractNumId w:val="991"/>
   </w:num>
   <w:num w:numId="1002">
-    <w:abstractNumId w:val="991"/>
-  </w:num>
-  <w:num w:numId="1003">
     <w:abstractNumId w:val="991"/>
   </w:num>
 </w:numbering>

</xml_diff>

<commit_message>
Entregable semana 2: ajuste de salto de página en la sección 5
</commit_message>
<xml_diff>
--- a/entregables/semana2/Entregable_Semana2_Pipeline_Reproducible_CarlosPerez.docx
+++ b/entregables/semana2/Entregable_Semana2_Pipeline_Reproducible_CarlosPerez.docx
@@ -1501,6 +1501,14 @@
         <w:t xml:space="preserve">5. Criterio preliminar de evaluación</w:t>
       </w:r>
     </w:p>
+    <w:p>
+      <w:pPr>
+        <w:pStyle w:val="FirstParagraph"/>
+      </w:pPr>
+      <w:r>
+        <w:t xml:space="preserve">Toda comparación entre modelos se hace con la misma partición (semilla 42, por paciente) y se reporta siempre la cascada, porque el pipeline completo rinde menos que sus etapas.</w:t>
+      </w:r>
+    </w:p>
     <w:tbl>
       <w:tblPr>
         <w:tblStyle w:val="Table"/>
@@ -1777,14 +1785,6 @@
         </w:tc>
       </w:tr>
     </w:tbl>
-    <w:p>
-      <w:pPr>
-        <w:pStyle w:val="BodyText"/>
-      </w:pPr>
-      <w:r>
-        <w:t xml:space="preserve">Toda comparación entre modelos se hace con la misma partición (semilla 42, por paciente) y se reporta siempre la cascada, porque el pipeline completo rinde menos que sus etapas.</w:t>
-      </w:r>
-    </w:p>
     <w:bookmarkEnd w:id="22"/>
     <w:bookmarkStart w:id="23" w:name="reproducibilidad"/>
     <w:p>

</xml_diff>

<commit_message>
Entregable semana 2: redacción dirigida al docente, sin rótulos internos ni sección de autoverificación
</commit_message>
<xml_diff>
--- a/entregables/semana2/Entregable_Semana2_Pipeline_Reproducible_CarlosPerez.docx
+++ b/entregables/semana2/Entregable_Semana2_Pipeline_Reproducible_CarlosPerez.docx
@@ -183,20 +183,7 @@
         <w:t xml:space="preserve"> </w:t>
       </w:r>
       <w:r>
-        <w:t xml:space="preserve">El título de la tesis es el mismo del proyecto aprobado en Trabajo de Investigación I (MIA-303, cerrado el 14-jul-2026). Lo que ha cambiado es lo que se ha probado y mejorado desde entonces: este diseño integra en un solo flujo la ejecución de la tesis (Fases 3v2 a 13), lo aprendido en el curso de Procesamiento de Lenguaje Natural (auditoría adversarial de 26 hallazgos) y la experiencia del sistema GEM·VigIA sobre reportes de EsSalud en producción. Todas las cifras provienen de archivos de resultados del proyecto; las que el propio proceso invalidó no se citan. Lo que es criterio propio va rotulado</w:t>
-      </w:r>
-      <w:r>
-        <w:t xml:space="preserve"> </w:t>
-      </w:r>
-      <w:r>
-        <w:rPr>
-          <w:b/>
-          <w:bCs/>
-        </w:rPr>
-        <w:t xml:space="preserve">[juicio técnico]</w:t>
-      </w:r>
-      <w:r>
-        <w:t xml:space="preserve">.</w:t>
+        <w:t xml:space="preserve">El título de la tesis se mantiene desde el proyecto aprobado en Trabajo de Investigación I (cerrado el 14 de julio de 2026). Este documento presenta el flujo experimental tal como se ejecutó y mejoró desde entonces (Fases 3v2 a 13), incorporando lo aprendido en el curso de Procesamiento de Lenguaje Natural (auditoría adversarial de 26 hallazgos) y en la aplicación del mismo enfoque a los reportes de seguridad del paciente de EsSalud dentro del sistema GEM·VigIA.</w:t>
       </w:r>
     </w:p>
     <w:bookmarkStart w:id="15" w:name="diagrama-del-flujo-principal"/>
@@ -703,23 +690,7 @@
         <w:t xml:space="preserve"> </w:t>
       </w:r>
       <w:r>
-        <w:t xml:space="preserve">del evento según la Tabla de Codificación (Anexo 02 de la misma Directiva), reducida a 6 clases con n suficiente. No hay valores faltantes numéricos ni escalamiento: el texto es la única entrada del modelo y TF-IDF ya normaliza; la fusión con variables tabulares prevista en el proyecto original</w:t>
-      </w:r>
-      <w:r>
-        <w:t xml:space="preserve"> </w:t>
-      </w:r>
-      <w:r>
-        <w:rPr>
-          <w:b/>
-          <w:bCs/>
-        </w:rPr>
-        <w:t xml:space="preserve">nunca se ejecutó</w:t>
-      </w:r>
-      <w:r>
-        <w:t xml:space="preserve"> </w:t>
-      </w:r>
-      <w:r>
-        <w:t xml:space="preserve">y queda fuera de alcance.</w:t>
+        <w:t xml:space="preserve">del evento según la Tabla de Codificación (Anexo 02 de la misma Directiva), reducida a 6 clases con n suficiente. No hay valores faltantes numéricos ni escalamiento: el texto es la única entrada del modelo y TF-IDF ya normaliza; la fusión con variables tabulares prevista en el proyecto original no se ejecutó y queda fuera del alcance.</w:t>
       </w:r>
     </w:p>
     <w:p>
@@ -1488,7 +1459,7 @@
         <w:t xml:space="preserve"> </w:t>
       </w:r>
       <w:r>
-        <w:t xml:space="preserve">kappa 0.0 (dice sí a todo). Causa medida: la ventana de 256 tokens cubre el 9 % de una epicrisis (mediana 3 148 tokens). Se documenta como resultado negativo; solo se reabriría con Longformer o BigBird y GPU dedicada.</w:t>
+        <w:t xml:space="preserve">kappa 0.0 (clasificó todos los casos como positivos). Causa medida: la ventana de 256 tokens cubre el 9 % de una epicrisis (mediana 3 148 tokens). Se documenta como resultado negativo; solo se reabriría con Longformer o BigBird y GPU dedicada.</w:t>
       </w:r>
     </w:p>
     <w:bookmarkEnd w:id="21"/>
@@ -1925,13 +1896,13 @@
           <w:b/>
           <w:bCs/>
         </w:rPr>
-        <w:t xml:space="preserve">Estado honesto (verificado el 25-set-2026):</w:t>
+        <w:t xml:space="preserve">Estado actual y brecha:</w:t>
       </w:r>
       <w:r>
         <w:t xml:space="preserve"> </w:t>
       </w:r>
       <w:r>
-        <w:t xml:space="preserve">no existe aún un archivo de dependencias con versiones fijadas, ni plantilla de variables de entorno, ni un orquestador que encadene las fases, ni la estructura data/raw y data/processed; hay 46 scripts, uno por fase; la sección</w:t>
+        <w:t xml:space="preserve">todavía no existe un archivo de dependencias con versiones fijadas, ni una plantilla de variables de entorno, ni un orquestador que encadene las fases, ni la estructura data/raw y data/processed; hay 46 scripts, uno por fase; la sección</w:t>
       </w:r>
       <w:r>
         <w:t xml:space="preserve"> </w:t>
@@ -1959,23 +1930,7 @@
         <w:t xml:space="preserve"> </w:t>
       </w:r>
       <w:r>
-        <w:t xml:space="preserve">de los transformers no se guardaron (solo son reproducibles reentrenando).</w:t>
-      </w:r>
-      <w:r>
-        <w:t xml:space="preserve"> </w:t>
-      </w:r>
-      <w:r>
-        <w:rPr>
-          <w:b/>
-          <w:bCs/>
-        </w:rPr>
-        <w:t xml:space="preserve">Sprint 1 del curso</w:t>
-      </w:r>
-      <w:r>
-        <w:t xml:space="preserve"> </w:t>
-      </w:r>
-      <w:r>
-        <w:t xml:space="preserve">= cerrar exactamente esto, con criterio de aceptación medible: que un tercero con credencial PhysioNet regenere la Fase 9 con un solo comando y obtenga sens 0.7623, esp 0.7699 y AUC 0.8426 con tolerancia ± 0.005.</w:t>
+        <w:t xml:space="preserve">de los transformers no se conservaron (solo son reproducibles reentrenando). El Sprint 1 del curso se dedica a cerrar esta brecha, con un criterio de aceptación medible: que un tercero con credencial PhysioNet regenere la Fase 9 con un solo comando y obtenga sens 0.7623, esp 0.7699 y AUC 0.8426 con tolerancia ± 0.005.</w:t>
       </w:r>
     </w:p>
     <w:bookmarkEnd w:id="23"/>
@@ -2103,7 +2058,7 @@
               <w:pStyle w:val="Compact"/>
             </w:pPr>
             <w:r>
-              <w:t xml:space="preserve">Emparejamiento de época en los negativos; la cifra 0.973 queda retirada</w:t>
+              <w:t xml:space="preserve">Emparejamiento de época en los negativos; se descarta la cifra 0.973</w:t>
             </w:r>
           </w:p>
         </w:tc>
@@ -2337,18 +2292,18 @@
               <w:pStyle w:val="Compact"/>
             </w:pPr>
             <w:r>
-              <w:t xml:space="preserve">Acuerdo de uso PhysioNet; incidente del 28-jul con datos personales del corpus ERSP</w:t>
-            </w:r>
-          </w:p>
-        </w:tc>
-        <w:tc>
-          <w:tcPr/>
-          <w:p>
-            <w:pPr>
-              <w:pStyle w:val="Compact"/>
-            </w:pPr>
-            <w:r>
-              <w:t xml:space="preserve">Modelo y datos fuera de git; repositorio privado e historial reescrito; comunicaciones formales pendientes</w:t>
+              <w:t xml:space="preserve">Acuerdo de uso PhysioNet; el corpus ERSP contiene datos personales</w:t>
+            </w:r>
+          </w:p>
+        </w:tc>
+        <w:tc>
+          <w:tcPr/>
+          <w:p>
+            <w:pPr>
+              <w:pStyle w:val="Compact"/>
+            </w:pPr>
+            <w:r>
+              <w:t xml:space="preserve">Modelo y datos fuera del control de versiones; repositorio privado; copias de trabajo del ERSP anonimizadas antes de cualquier uso</w:t>
             </w:r>
           </w:p>
         </w:tc>
@@ -2406,40 +2361,6 @@
       </w:tr>
     </w:tbl>
     <w:bookmarkEnd w:id="24"/>
-    <w:bookmarkStart w:id="25" w:name="verificación-contra-la-guía-sección-11"/>
-    <w:p>
-      <w:pPr>
-        <w:pStyle w:val="Heading1"/>
-      </w:pPr>
-      <w:r>
-        <w:t xml:space="preserve">8. Verificación contra la guía (sección 11)</w:t>
-      </w:r>
-    </w:p>
-    <w:p>
-      <w:pPr>
-        <w:pStyle w:val="FirstParagraph"/>
-      </w:pPr>
-      <w:r>
-        <w:t xml:space="preserve">Diagrama acorde al tipo de tesis, entradas y salidas por etapa, criterio de resultado correcto, registro para reproducir, separación desarrollo/evaluación y riesgos (diez): cubiertos en las secciones 1 a 7. Alcance ejecutable con los recursos del curso:</w:t>
-      </w:r>
-      <w:r>
-        <w:t xml:space="preserve"> </w:t>
-      </w:r>
-      <w:r>
-        <w:rPr>
-          <w:b/>
-          <w:bCs/>
-        </w:rPr>
-        <w:t xml:space="preserve">[juicio técnico]</w:t>
-      </w:r>
-      <w:r>
-        <w:t xml:space="preserve"> </w:t>
-      </w:r>
-      <w:r>
-        <w:t xml:space="preserve">sí, porque el modelo ya existe, el acceso a los datos está vigente hasta 2029 y el Sprint 1 es de reproducibilidad, no de modelado.</w:t>
-      </w:r>
-    </w:p>
-    <w:bookmarkEnd w:id="25"/>
     <w:sectPr>
       <w:footnotePr>
         <w:numRestart w:val="eachSect"/>

</xml_diff>

<commit_message>
Entregable semana 2: explicación de la supervisión débil y del alcance sin anotación adicional
</commit_message>
<xml_diff>
--- a/entregables/semana2/Entregable_Semana2_Pipeline_Reproducible_CarlosPerez.docx
+++ b/entregables/semana2/Entregable_Semana2_Pipeline_Reproducible_CarlosPerez.docx
@@ -149,7 +149,7 @@
         <w:t xml:space="preserve"> </w:t>
       </w:r>
       <w:r>
-        <w:t xml:space="preserve">aprendizaje supervisado (clasificación de texto clínico), con dos adaptaciones: la etiqueta de entrenamiento es de</w:t>
+        <w:t xml:space="preserve">aprendizaje supervisado (clasificación de texto clínico). La etiqueta de entrenamiento se obtiene por</w:t>
       </w:r>
       <w:r>
         <w:t xml:space="preserve"> </w:t>
@@ -165,7 +165,17 @@
         <w:t xml:space="preserve"> </w:t>
       </w:r>
       <w:r>
-        <w:t xml:space="preserve">(códigos CIE-10 causales) y la evaluación se cierra con un panel de expertos y con un corpus en español con etiqueta humana.</w:t>
+        <w:t xml:space="preserve">(</w:t>
+      </w:r>
+      <w:r>
+        <w:rPr>
+          <w:i/>
+          <w:iCs/>
+        </w:rPr>
+        <w:t xml:space="preserve">weak supervision</w:t>
+      </w:r>
+      <w:r>
+        <w:t xml:space="preserve">): no la asigna un anotador leyendo cada epicrisis, sino que se deriva automáticamente de los códigos CIE-10 causales registrados en la misma hospitalización (etiqueta A1). Esto permite entrenar con 70 000 epicrisis sin anotación manual masiva; el costo es que la etiqueta tiene ruido, y por eso su calidad se verifica con dos referencias externas ya construidas: un panel de expertos sobre una muestra de epicrisis y un corpus en español con etiqueta humana (ERSP de EsSalud). No se prevé procesar ni anotar más datos: el diseño trabaja con el corpus y las referencias ya existentes.</w:t>
       </w:r>
     </w:p>
     <w:p>

</xml_diff>

<commit_message>
Entregable semana 2: sin numeración interna de fases; cada fase descrita por lo que hizo
</commit_message>
<xml_diff>
--- a/entregables/semana2/Entregable_Semana2_Pipeline_Reproducible_CarlosPerez.docx
+++ b/entregables/semana2/Entregable_Semana2_Pipeline_Reproducible_CarlosPerez.docx
@@ -193,7 +193,7 @@
         <w:t xml:space="preserve"> </w:t>
       </w:r>
       <w:r>
-        <w:t xml:space="preserve">El título de la tesis se mantiene desde el proyecto aprobado en Trabajo de Investigación I (cerrado el 14 de julio de 2026). Este documento presenta el flujo experimental tal como se ejecutó y mejoró desde entonces (Fases 3v2 a 13), incorporando lo aprendido en el curso de Procesamiento de Lenguaje Natural (auditoría adversarial de 26 hallazgos) y en la aplicación del mismo enfoque a los reportes de seguridad del paciente de EsSalud dentro del sistema GEM·VigIA.</w:t>
+        <w:t xml:space="preserve">El título de la tesis se mantiene desde el proyecto aprobado en Trabajo de Investigación I (cerrado el 14 de julio de 2026). Este documento presenta el flujo experimental tal como se ejecutó y mejoró desde entonces (construcción del corpus completo, modelo final, validación con expertos y comparación con transformers y un modelo de lenguaje), incorporando lo aprendido en el curso de Procesamiento de Lenguaje Natural (auditoría adversarial de 26 hallazgos) y en la aplicación del mismo enfoque a los reportes de seguridad del paciente de EsSalud dentro del sistema GEM·VigIA.</w:t>
       </w:r>
     </w:p>
     <w:bookmarkStart w:id="15" w:name="diagrama-del-flujo-principal"/>
@@ -731,7 +731,7 @@
         <w:t xml:space="preserve">paciente</w:t>
       </w:r>
       <w:r>
-        <w:t xml:space="preserve">: ningún paciente aparece a la vez en train y test. En la Fase 4 se comprobó que el split por paciente no degrada el rendimiento (F1-macro 0.492 ± 0.018) y desde entonces es obligatorio. Desarrollo y ajuste se hacen con validación cruzada de 5 pliegues dentro del train; el test se toca una sola vez; el panel experto y el corpus ERSP actúan como evaluación externa.</w:t>
+        <w:t xml:space="preserve">: ningún paciente aparece a la vez en train y test. En la comparación inicial de modelos se comprobó que el split por paciente no degrada el rendimiento (F1-macro 0.492 ± 0.018) y desde entonces es obligatorio. Desarrollo y ajuste se hacen con validación cruzada de 5 pliegues dentro del train; el test se toca una sola vez; el panel experto y el corpus ERSP actúan como evaluación externa.</w:t>
       </w:r>
     </w:p>
     <w:bookmarkEnd w:id="16"/>
@@ -1409,7 +1409,7 @@
         <w:t xml:space="preserve"> </w:t>
       </w:r>
       <w:r>
-        <w:t xml:space="preserve">reglas regex Tier B + NegEx, precisión 65.7 % (IC95 54.0–75.8, n = 70, validación experta de mayo), y TF-IDF + regresión logística (Fase 4).</w:t>
+        <w:t xml:space="preserve">reglas regex Tier B + NegEx, precisión 65.7 % (IC95 54.0–75.8, n = 70, validación experta de mayo), y TF-IDF + regresión logística (comparación inicial de modelos).</w:t>
       </w:r>
     </w:p>
     <w:p>
@@ -1431,7 +1431,7 @@
         <w:t xml:space="preserve"> </w:t>
       </w:r>
       <w:r>
-        <w:t xml:space="preserve">modelo lineal sobre TF-IDF (LinearSVC balanceado), en cascada. Es el modelo vigente desde la Fase 9 (29-jul-2026).</w:t>
+        <w:t xml:space="preserve">modelo lineal sobre TF-IDF (LinearSVC balanceado), en cascada. Es el modelo vigente desde el 29 de julio de 2026.</w:t>
       </w:r>
     </w:p>
     <w:p>
@@ -1940,7 +1940,7 @@
         <w:t xml:space="preserve"> </w:t>
       </w:r>
       <w:r>
-        <w:t xml:space="preserve">de los transformers no se conservaron (solo son reproducibles reentrenando). El Sprint 1 del curso se dedica a cerrar esta brecha, con un criterio de aceptación medible: que un tercero con credencial PhysioNet regenere la Fase 9 con un solo comando y obtenga sens 0.7623, esp 0.7699 y AUC 0.8426 con tolerancia ± 0.005.</w:t>
+        <w:t xml:space="preserve">de los transformers no se conservaron (solo son reproducibles reentrenando). El Sprint 1 del curso se dedica a cerrar esta brecha, con un criterio de aceptación medible: que un tercero con credencial PhysioNet regenere el modelo final y sus métricas con un solo comando y obtenga sens 0.7623, esp 0.7699 y AUC 0.8426 con tolerancia ± 0.005.</w:t>
       </w:r>
     </w:p>
     <w:bookmarkEnd w:id="23"/>
@@ -2057,7 +2057,7 @@
               <w:pStyle w:val="Compact"/>
             </w:pPr>
             <w:r>
-              <w:t xml:space="preserve">Tesis, Fase 7: AUC 0.973 → 0.840 al emparejar</w:t>
+              <w:t xml:space="preserve">Tesis, análisis del confusor de época: AUC 0.973 → 0.840 al emparejar</w:t>
             </w:r>
           </w:p>
         </w:tc>
@@ -2197,7 +2197,7 @@
               <w:pStyle w:val="Compact"/>
             </w:pPr>
             <w:r>
-              <w:t xml:space="preserve">Tesis, Fases 4 y 9</w:t>
+              <w:t xml:space="preserve">Tesis, comparación de modelos y modelo final</w:t>
             </w:r>
           </w:p>
         </w:tc>

</xml_diff>